<commit_message>
Manual atualizado (0.3.0) + extensão usa o nome DNS da máquina
- Manual (HTML/PDF/DOCX): exclusão do Defender na instalação do agente, aba
  Governança > Estações (farol agente/extensão), versões 0.3.0, troubleshooting
  de farol 'Sem sinal'. DOCX regenerado a partir do HTML.
- Extensão: AGENTE_PADRAO passa a ser http://macbook-pro.local:8765 (nome da
  máquina, não IP). Pacotes 0.3.0 regerados.

Co-Authored-By: Claude Opus 4.8 <noreply@anthropic.com>
</commit_message>
<xml_diff>
--- a/apresentacao/GerencIA-Manual-Instalacao.docx
+++ b/apresentacao/GerencIA-Manual-Instalacao.docx
@@ -5,33 +5,40 @@
     <w:p>
       <w:r>
         <w:rPr>
-          <w:rFonts w:ascii="Georgia" w:hAnsi="Georgia"/>
           <w:b/>
-          <w:color w:val="0F3B2C"/>
-          <w:sz w:val="44"/>
+          <w:color w:val="1C6B4D"/>
+          <w:sz w:val="16"/>
         </w:rPr>
-        <w:t>GerencIA — Manual de instalação</w:t>
+        <w:t>RASTREABILIDADE E GOVERNANÇA DE INFORMAÇÕES EM IA</w:t>
       </w:r>
     </w:p>
     <w:p>
       <w:pPr>
-        <w:spacing w:line="300" w:lineRule="auto"/>
+        <w:pStyle w:val="Title"/>
       </w:pPr>
       <w:r>
         <w:rPr>
-          <w:color w:val="5A6A62"/>
-          <w:sz w:val="20"/>
+          <w:b w:val="0"/>
         </w:rPr>
-        <w:t>Rastreabilidade e governança de informações em IA · Desafio 2 · Stark Bank. Instalação de ponta a ponta: servidor (coletor + IA local) e estações (agente + extensão), com verificação e solução de problemas.</w:t>
+        <w:t>Manual de instalação</w:t>
       </w:r>
     </w:p>
     <w:p>
       <w:r>
         <w:rPr>
-          <w:rFonts w:ascii="Georgia" w:hAnsi="Georgia"/>
-          <w:b/>
-          <w:color w:val="0F3B2C"/>
-          <w:sz w:val="30"/>
+          <w:b w:val="0"/>
+        </w:rPr>
+        <w:t>Como instalar a GerencIA de ponta a ponta: o servidor (coletor + IA local) e as estações dos usuários (agente + extensão), com verificação e solução de problemas.</w:t>
+      </w:r>
+    </w:p>
+    <w:p>
+      <w:pPr>
+        <w:pStyle w:val="Heading1"/>
+      </w:pPr>
+      <w:r>
+        <w:rPr>
+          <w:b w:val="0"/>
+          <w:color w:val="1C3B2E"/>
         </w:rPr>
         <w:t>Visão geral — o que vai onde</w:t>
       </w:r>
@@ -43,22 +50,20 @@
         <w:tblLook w:firstColumn="1" w:firstRow="1" w:lastColumn="0" w:lastRow="0" w:noHBand="0" w:noVBand="1" w:val="04A0"/>
       </w:tblPr>
       <w:tblGrid>
-        <w:gridCol w:w="3120"/>
-        <w:gridCol w:w="3120"/>
-        <w:gridCol w:w="3120"/>
+        <w:gridCol w:w="2880"/>
+        <w:gridCol w:w="2880"/>
+        <w:gridCol w:w="2880"/>
       </w:tblGrid>
       <w:tr>
         <w:tc>
           <w:tcPr>
-            <w:tcW w:type="dxa" w:w="3120"/>
+            <w:tcW w:type="dxa" w:w="2880"/>
           </w:tcPr>
           <w:p>
             <w:r/>
             <w:r>
               <w:rPr>
-                <w:b/>
-                <w:color w:val="0F3B2C"/>
-                <w:sz w:val="19"/>
+                <w:b w:val="0"/>
               </w:rPr>
               <w:t>Componente</w:t>
             </w:r>
@@ -66,15 +71,13 @@
         </w:tc>
         <w:tc>
           <w:tcPr>
-            <w:tcW w:type="dxa" w:w="3120"/>
+            <w:tcW w:type="dxa" w:w="2880"/>
           </w:tcPr>
           <w:p>
             <w:r/>
             <w:r>
               <w:rPr>
-                <w:b/>
-                <w:color w:val="0F3B2C"/>
-                <w:sz w:val="19"/>
+                <w:b w:val="0"/>
               </w:rPr>
               <w:t>Onde roda</w:t>
             </w:r>
@@ -82,15 +85,13 @@
         </w:tc>
         <w:tc>
           <w:tcPr>
-            <w:tcW w:type="dxa" w:w="3120"/>
+            <w:tcW w:type="dxa" w:w="2880"/>
           </w:tcPr>
           <w:p>
             <w:r/>
             <w:r>
               <w:rPr>
-                <w:b/>
-                <w:color w:val="0F3B2C"/>
-                <w:sz w:val="19"/>
+                <w:b w:val="0"/>
               </w:rPr>
               <w:t>Para quê</w:t>
             </w:r>
@@ -100,13 +101,13 @@
       <w:tr>
         <w:tc>
           <w:tcPr>
-            <w:tcW w:type="dxa" w:w="3120"/>
+            <w:tcW w:type="dxa" w:w="2880"/>
           </w:tcPr>
           <w:p>
             <w:r/>
             <w:r>
               <w:rPr>
-                <w:sz w:val="19"/>
+                <w:b/>
               </w:rPr>
               <w:t>Coletor</w:t>
             </w:r>
@@ -114,29 +115,29 @@
         </w:tc>
         <w:tc>
           <w:tcPr>
-            <w:tcW w:type="dxa" w:w="3120"/>
+            <w:tcW w:type="dxa" w:w="2880"/>
           </w:tcPr>
           <w:p>
             <w:r/>
             <w:r>
               <w:rPr>
-                <w:sz w:val="19"/>
+                <w:b w:val="0"/>
               </w:rPr>
-              <w:t>Servidor on-premise</w:t>
+              <w:t>Servidor (Mac/Linux, on-premise)</w:t>
             </w:r>
           </w:p>
         </w:tc>
         <w:tc>
           <w:tcPr>
-            <w:tcW w:type="dxa" w:w="3120"/>
+            <w:tcW w:type="dxa" w:w="2880"/>
           </w:tcPr>
           <w:p>
             <w:r/>
             <w:r>
               <w:rPr>
-                <w:sz w:val="19"/>
+                <w:b w:val="0"/>
               </w:rPr>
-              <w:t>Recebe capturas, resolve identidade, aplica o motor, serve o painel</w:t>
+              <w:t>Recebe as capturas, resolve identidade, aplica o motor, serve o painel</w:t>
             </w:r>
           </w:p>
         </w:tc>
@@ -144,13 +145,13 @@
       <w:tr>
         <w:tc>
           <w:tcPr>
-            <w:tcW w:type="dxa" w:w="3120"/>
+            <w:tcW w:type="dxa" w:w="2880"/>
           </w:tcPr>
           <w:p>
             <w:r/>
             <w:r>
               <w:rPr>
-                <w:sz w:val="19"/>
+                <w:b/>
               </w:rPr>
               <w:t>Qwen3 (llamafile)</w:t>
             </w:r>
@@ -158,13 +159,13 @@
         </w:tc>
         <w:tc>
           <w:tcPr>
-            <w:tcW w:type="dxa" w:w="3120"/>
+            <w:tcW w:type="dxa" w:w="2880"/>
           </w:tcPr>
           <w:p>
             <w:r/>
             <w:r>
               <w:rPr>
-                <w:sz w:val="19"/>
+                <w:b w:val="0"/>
               </w:rPr>
               <w:t>Servidor</w:t>
             </w:r>
@@ -172,15 +173,15 @@
         </w:tc>
         <w:tc>
           <w:tcPr>
-            <w:tcW w:type="dxa" w:w="3120"/>
+            <w:tcW w:type="dxa" w:w="2880"/>
           </w:tcPr>
           <w:p>
             <w:r/>
             <w:r>
               <w:rPr>
-                <w:sz w:val="19"/>
+                <w:b w:val="0"/>
               </w:rPr>
-              <w:t>Classificação de conteúdo Nível 1, local — conteúdo não sai</w:t>
+              <w:t>Classificação de conteúdo Nível 1, local — o conteúdo não sai</w:t>
             </w:r>
           </w:p>
         </w:tc>
@@ -188,13 +189,13 @@
       <w:tr>
         <w:tc>
           <w:tcPr>
-            <w:tcW w:type="dxa" w:w="3120"/>
+            <w:tcW w:type="dxa" w:w="2880"/>
           </w:tcPr>
           <w:p>
             <w:r/>
             <w:r>
               <w:rPr>
-                <w:sz w:val="19"/>
+                <w:b/>
               </w:rPr>
               <w:t>Agente</w:t>
             </w:r>
@@ -202,13 +203,13 @@
         </w:tc>
         <w:tc>
           <w:tcPr>
-            <w:tcW w:type="dxa" w:w="3120"/>
+            <w:tcW w:type="dxa" w:w="2880"/>
           </w:tcPr>
           <w:p>
             <w:r/>
             <w:r>
               <w:rPr>
-                <w:sz w:val="19"/>
+                <w:b w:val="0"/>
               </w:rPr>
               <w:t>Estação Windows (serviço)</w:t>
             </w:r>
@@ -216,13 +217,13 @@
         </w:tc>
         <w:tc>
           <w:tcPr>
-            <w:tcW w:type="dxa" w:w="3120"/>
+            <w:tcW w:type="dxa" w:w="2880"/>
           </w:tcPr>
           <w:p>
             <w:r/>
             <w:r>
               <w:rPr>
-                <w:sz w:val="19"/>
+                <w:b w:val="0"/>
               </w:rPr>
               <w:t>Detecta uso de IA em qualquer app (metadado), sobe no boot</w:t>
             </w:r>
@@ -232,13 +233,13 @@
       <w:tr>
         <w:tc>
           <w:tcPr>
-            <w:tcW w:type="dxa" w:w="3120"/>
+            <w:tcW w:type="dxa" w:w="2880"/>
           </w:tcPr>
           <w:p>
             <w:r/>
             <w:r>
               <w:rPr>
-                <w:sz w:val="19"/>
+                <w:b/>
               </w:rPr>
               <w:t>Extensão</w:t>
             </w:r>
@@ -246,13 +247,13 @@
         </w:tc>
         <w:tc>
           <w:tcPr>
-            <w:tcW w:type="dxa" w:w="3120"/>
+            <w:tcW w:type="dxa" w:w="2880"/>
           </w:tcPr>
           <w:p>
             <w:r/>
             <w:r>
               <w:rPr>
-                <w:sz w:val="19"/>
+                <w:b w:val="0"/>
               </w:rPr>
               <w:t>Navegador da estação</w:t>
             </w:r>
@@ -260,15 +261,15 @@
         </w:tc>
         <w:tc>
           <w:tcPr>
-            <w:tcW w:type="dxa" w:w="3120"/>
+            <w:tcW w:type="dxa" w:w="2880"/>
           </w:tcPr>
           <w:p>
             <w:r/>
             <w:r>
               <w:rPr>
-                <w:sz w:val="19"/>
+                <w:b w:val="0"/>
               </w:rPr>
-              <w:t>Captura conteúdo (prompt + resposta)</w:t>
+              <w:t>Captura o conteúdo (prompt + resposta) no navegador</w:t>
             </w:r>
           </w:p>
         </w:tc>
@@ -276,13 +277,13 @@
       <w:tr>
         <w:tc>
           <w:tcPr>
-            <w:tcW w:type="dxa" w:w="3120"/>
+            <w:tcW w:type="dxa" w:w="2880"/>
           </w:tcPr>
           <w:p>
             <w:r/>
             <w:r>
               <w:rPr>
-                <w:sz w:val="19"/>
+                <w:b/>
               </w:rPr>
               <w:t>Host nativo</w:t>
             </w:r>
@@ -290,13 +291,13 @@
         </w:tc>
         <w:tc>
           <w:tcPr>
-            <w:tcW w:type="dxa" w:w="3120"/>
+            <w:tcW w:type="dxa" w:w="2880"/>
           </w:tcPr>
           <w:p>
             <w:r/>
             <w:r>
               <w:rPr>
-                <w:sz w:val="19"/>
+                <w:b w:val="0"/>
               </w:rPr>
               <w:t>Estação (por usuário)</w:t>
             </w:r>
@@ -304,41 +305,152 @@
         </w:tc>
         <w:tc>
           <w:tcPr>
-            <w:tcW w:type="dxa" w:w="3120"/>
+            <w:tcW w:type="dxa" w:w="2880"/>
           </w:tcPr>
           <w:p>
             <w:r/>
             <w:r>
               <w:rPr>
-                <w:sz w:val="19"/>
+                <w:b w:val="0"/>
               </w:rPr>
-              <w:t>Informa à extensão o usuário logado</w:t>
+              <w:t>Informa à extensão o usuário logado no Windows</w:t>
             </w:r>
           </w:p>
         </w:tc>
       </w:tr>
     </w:tbl>
+    <w:p/>
     <w:p>
+      <w:pPr>
+        <w:pStyle w:val="Heading1"/>
+      </w:pPr>
       <w:r>
         <w:rPr>
-          <w:rFonts w:ascii="Georgia" w:hAnsi="Georgia"/>
+          <w:b w:val="0"/>
+          <w:color w:val="1C3B2E"/>
+        </w:rPr>
+        <w:t>Pré-requisitos</w:t>
+      </w:r>
+    </w:p>
+    <w:p>
+      <w:pPr>
+        <w:pStyle w:val="ListBullet"/>
+      </w:pPr>
+      <w:r>
+        <w:rPr>
           <w:b/>
-          <w:color w:val="0F3B2C"/>
-          <w:sz w:val="30"/>
+        </w:rPr>
+        <w:t>Servidor:</w:t>
+      </w:r>
+      <w:r>
+        <w:rPr>
+          <w:b w:val="0"/>
+        </w:rPr>
+        <w:t xml:space="preserve"> Python 3.9+ (o coletor roda sem </w:t>
+      </w:r>
+      <w:r>
+        <w:rPr>
+          <w:rFonts w:ascii="Consolas" w:hAnsi="Consolas"/>
+          <w:b w:val="0"/>
+          <w:sz w:val="19"/>
+        </w:rPr>
+        <w:t>pip install</w:t>
+      </w:r>
+      <w:r>
+        <w:rPr>
+          <w:b w:val="0"/>
+        </w:rPr>
+        <w:t>). Para o Nível 1: ~2,7 GB livres (llamafile + Qwen3).</w:t>
+      </w:r>
+    </w:p>
+    <w:p>
+      <w:pPr>
+        <w:pStyle w:val="ListBullet"/>
+      </w:pPr>
+      <w:r>
+        <w:rPr>
+          <w:b/>
+        </w:rPr>
+        <w:t>Estação:</w:t>
+      </w:r>
+      <w:r>
+        <w:rPr>
+          <w:b w:val="0"/>
+        </w:rPr>
+        <w:t xml:space="preserve"> Windows 10/11, acesso de administrador, Python 3.9+ (o instalador do agente instala se faltar).</w:t>
+      </w:r>
+    </w:p>
+    <w:p>
+      <w:pPr>
+        <w:pStyle w:val="ListBullet"/>
+      </w:pPr>
+      <w:r>
+        <w:rPr>
+          <w:b/>
+        </w:rPr>
+        <w:t>Rede:</w:t>
+      </w:r>
+      <w:r>
+        <w:rPr>
+          <w:b w:val="0"/>
+        </w:rPr>
+        <w:t xml:space="preserve"> as estações precisam alcançar o servidor (ex.: </w:t>
+      </w:r>
+      <w:r>
+        <w:rPr>
+          <w:rFonts w:ascii="Consolas" w:hAnsi="Consolas"/>
+          <w:b w:val="0"/>
+          <w:sz w:val="19"/>
+        </w:rPr>
+        <w:t>http://10.211.55.2:8765</w:t>
+      </w:r>
+      <w:r>
+        <w:rPr>
+          <w:b w:val="0"/>
+        </w:rPr>
+        <w:t xml:space="preserve"> ou </w:t>
+      </w:r>
+      <w:r>
+        <w:rPr>
+          <w:rFonts w:ascii="Consolas" w:hAnsi="Consolas"/>
+          <w:b w:val="0"/>
+          <w:sz w:val="19"/>
+        </w:rPr>
+        <w:t>http://macbook-pro.local:8765</w:t>
+      </w:r>
+      <w:r>
+        <w:rPr>
+          <w:b w:val="0"/>
+        </w:rPr>
+        <w:t>).</w:t>
+      </w:r>
+    </w:p>
+    <w:p>
+      <w:pPr>
+        <w:pStyle w:val="Heading1"/>
+      </w:pPr>
+      <w:r>
+        <w:rPr>
+          <w:b w:val="0"/>
+          <w:color w:val="1C3B2E"/>
         </w:rPr>
         <w:t>Links de download (GitHub)</w:t>
       </w:r>
     </w:p>
     <w:p>
-      <w:pPr>
-        <w:spacing w:line="300" w:lineRule="auto"/>
-      </w:pPr>
       <w:r>
         <w:rPr>
-          <w:color w:val="2C2C2A"/>
-          <w:sz w:val="22"/>
+          <w:b w:val="0"/>
         </w:rPr>
-        <w:t>Base: https://raw.githubusercontent.com/lucibad/espia-starkbank/main/</w:t>
+        <w:t xml:space="preserve">Base: </w:t>
+      </w:r>
+      <w:r>
+        <w:rPr>
+          <w:rFonts w:ascii="Consolas" w:hAnsi="Consolas"/>
+          <w:b w:val="0"/>
+          <w:sz w:val="19"/>
+        </w:rPr>
+        <w:t>https://raw.githubusercontent.com/lucibad/espia-starkbank/main/</w:t>
       </w:r>
     </w:p>
     <w:tbl>
@@ -348,53 +460,19 @@
         <w:tblLook w:firstColumn="1" w:firstRow="1" w:lastColumn="0" w:lastRow="0" w:noHBand="0" w:noVBand="1" w:val="04A0"/>
       </w:tblPr>
       <w:tblGrid>
-        <w:gridCol w:w="4680"/>
-        <w:gridCol w:w="4680"/>
+        <w:gridCol w:w="4320"/>
+        <w:gridCol w:w="4320"/>
       </w:tblGrid>
       <w:tr>
         <w:tc>
           <w:tcPr>
-            <w:tcW w:type="dxa" w:w="4680"/>
+            <w:tcW w:type="dxa" w:w="4320"/>
           </w:tcPr>
           <w:p>
             <w:r/>
             <w:r>
               <w:rPr>
-                <w:b/>
-                <w:color w:val="0F3B2C"/>
-                <w:sz w:val="19"/>
-              </w:rPr>
-              <w:t>Item</w:t>
-            </w:r>
-          </w:p>
-        </w:tc>
-        <w:tc>
-          <w:tcPr>
-            <w:tcW w:type="dxa" w:w="4680"/>
-          </w:tcPr>
-          <w:p>
-            <w:r/>
-            <w:r>
-              <w:rPr>
-                <w:b/>
-                <w:color w:val="0F3B2C"/>
-                <w:sz w:val="19"/>
-              </w:rPr>
-              <w:t>Caminho</w:t>
-            </w:r>
-          </w:p>
-        </w:tc>
-      </w:tr>
-      <w:tr>
-        <w:tc>
-          <w:tcPr>
-            <w:tcW w:type="dxa" w:w="4680"/>
-          </w:tcPr>
-          <w:p>
-            <w:r/>
-            <w:r>
-              <w:rPr>
-                <w:sz w:val="19"/>
+                <w:b w:val="0"/>
               </w:rPr>
               <w:t>Agente da estação</w:t>
             </w:r>
@@ -402,12 +480,14 @@
         </w:tc>
         <w:tc>
           <w:tcPr>
-            <w:tcW w:type="dxa" w:w="4680"/>
+            <w:tcW w:type="dxa" w:w="4320"/>
           </w:tcPr>
           <w:p>
             <w:r/>
             <w:r>
               <w:rPr>
+                <w:rFonts w:ascii="Consolas" w:hAnsi="Consolas"/>
+                <w:b w:val="0"/>
                 <w:sz w:val="19"/>
               </w:rPr>
               <w:t>borda/pacotes/GerencIA-Agente-Estacao.zip</w:t>
@@ -418,13 +498,13 @@
       <w:tr>
         <w:tc>
           <w:tcPr>
-            <w:tcW w:type="dxa" w:w="4680"/>
+            <w:tcW w:type="dxa" w:w="4320"/>
           </w:tcPr>
           <w:p>
             <w:r/>
             <w:r>
               <w:rPr>
-                <w:sz w:val="19"/>
+                <w:b w:val="0"/>
               </w:rPr>
               <w:t>Extensão Chrome/Edge</w:t>
             </w:r>
@@ -432,15 +512,17 @@
         </w:tc>
         <w:tc>
           <w:tcPr>
-            <w:tcW w:type="dxa" w:w="4680"/>
+            <w:tcW w:type="dxa" w:w="4320"/>
           </w:tcPr>
           <w:p>
             <w:r/>
             <w:r>
               <w:rPr>
+                <w:rFonts w:ascii="Consolas" w:hAnsi="Consolas"/>
+                <w:b w:val="0"/>
                 <w:sz w:val="19"/>
               </w:rPr>
-              <w:t>borda/pacotes/gerencia-extensao-chrome-edge-0.2.2.zip</w:t>
+              <w:t>borda/pacotes/gerencia-extensao-chrome-edge-0.3.0.zip</w:t>
             </w:r>
           </w:p>
         </w:tc>
@@ -448,13 +530,13 @@
       <w:tr>
         <w:tc>
           <w:tcPr>
-            <w:tcW w:type="dxa" w:w="4680"/>
+            <w:tcW w:type="dxa" w:w="4320"/>
           </w:tcPr>
           <w:p>
             <w:r/>
             <w:r>
               <w:rPr>
-                <w:sz w:val="19"/>
+                <w:b w:val="0"/>
               </w:rPr>
               <w:t>Extensão Firefox (.xpi)</w:t>
             </w:r>
@@ -462,15 +544,17 @@
         </w:tc>
         <w:tc>
           <w:tcPr>
-            <w:tcW w:type="dxa" w:w="4680"/>
+            <w:tcW w:type="dxa" w:w="4320"/>
           </w:tcPr>
           <w:p>
             <w:r/>
             <w:r>
               <w:rPr>
+                <w:rFonts w:ascii="Consolas" w:hAnsi="Consolas"/>
+                <w:b w:val="0"/>
                 <w:sz w:val="19"/>
               </w:rPr>
-              <w:t>borda/pacotes/gerencia-extensao-firefox-0.2.2.xpi</w:t>
+              <w:t>borda/pacotes/gerencia-extensao-firefox-0.3.0.xpi</w:t>
             </w:r>
           </w:p>
         </w:tc>
@@ -478,13 +562,13 @@
       <w:tr>
         <w:tc>
           <w:tcPr>
-            <w:tcW w:type="dxa" w:w="4680"/>
+            <w:tcW w:type="dxa" w:w="4320"/>
           </w:tcPr>
           <w:p>
             <w:r/>
             <w:r>
               <w:rPr>
-                <w:sz w:val="19"/>
+                <w:b w:val="0"/>
               </w:rPr>
               <w:t>Atualizador da extensão</w:t>
             </w:r>
@@ -492,12 +576,14 @@
         </w:tc>
         <w:tc>
           <w:tcPr>
-            <w:tcW w:type="dxa" w:w="4680"/>
+            <w:tcW w:type="dxa" w:w="4320"/>
           </w:tcPr>
           <w:p>
             <w:r/>
             <w:r>
               <w:rPr>
+                <w:rFonts w:ascii="Consolas" w:hAnsi="Consolas"/>
+                <w:b w:val="0"/>
                 <w:sz w:val="19"/>
               </w:rPr>
               <w:t>borda/extensao/ATUALIZAR-EXTENSAO.ps1</w:t>
@@ -506,236 +592,835 @@
         </w:tc>
       </w:tr>
     </w:tbl>
+    <w:p/>
     <w:p>
+      <w:pPr>
+        <w:pStyle w:val="Heading1"/>
+      </w:pPr>
       <w:r>
         <w:rPr>
-          <w:rFonts w:ascii="Georgia" w:hAnsi="Georgia"/>
-          <w:b/>
-          <w:color w:val="0F3B2C"/>
-          <w:sz w:val="30"/>
+          <w:b w:val="0"/>
+          <w:color w:val="1C3B2E"/>
         </w:rPr>
         <w:t>Parte A — Servidor (on-premise)</w:t>
       </w:r>
     </w:p>
     <w:p>
       <w:pPr>
-        <w:spacing w:line="300" w:lineRule="auto"/>
+        <w:pStyle w:val="Heading2"/>
       </w:pPr>
       <w:r>
         <w:rPr>
-          <w:color w:val="2C2C2A"/>
-          <w:sz w:val="22"/>
+          <w:b w:val="0"/>
+          <w:color w:val="1C6B4D"/>
         </w:rPr>
-        <w:t>1) Subir o coletor (na pasta do projeto, exposto à rede):</w:t>
-      </w:r>
-    </w:p>
-    <w:p>
-      <w:pPr>
-        <w:shd w:val="clear" w:fill="0F3B2C"/>
-      </w:pPr>
-      <w:r>
-        <w:rPr>
-          <w:rFonts w:ascii="Consolas" w:hAnsi="Consolas"/>
-          <w:color w:val="EAF3EE"/>
-          <w:sz w:val="19"/>
-        </w:rPr>
-        <w:t>cd ~/Downloads/espia</w:t>
-        <w:br/>
-        <w:t>python3 run.py gerar</w:t>
-        <w:br/>
-        <w:t>ESPIA_BIND=0.0.0.0 python3 run.py coletor</w:t>
-      </w:r>
-    </w:p>
-    <w:p>
-      <w:pPr>
-        <w:spacing w:line="300" w:lineRule="auto"/>
-      </w:pPr>
-      <w:r>
-        <w:rPr>
-          <w:color w:val="2C2C2A"/>
-          <w:sz w:val="22"/>
-        </w:rPr>
-        <w:t>2) Instalar e subir o LLM local (Nível 1 · Qwen3):</w:t>
-      </w:r>
-    </w:p>
-    <w:p>
-      <w:pPr>
-        <w:shd w:val="clear" w:fill="0F3B2C"/>
-      </w:pPr>
-      <w:r>
-        <w:rPr>
-          <w:rFonts w:ascii="Consolas" w:hAnsi="Consolas"/>
-          <w:color w:val="EAF3EE"/>
-          <w:sz w:val="19"/>
-        </w:rPr>
-        <w:t>bash llm-local/instalar-llm-local.sh   # baixa llamafile + Qwen3 (~2,7 GB)</w:t>
-        <w:br/>
-        <w:t>bash llm-local/rodar-llm-local.sh      # sobe o modelo em 127.0.0.1:8090</w:t>
-      </w:r>
-    </w:p>
-    <w:p>
-      <w:pPr>
-        <w:spacing w:line="300" w:lineRule="auto"/>
-      </w:pPr>
-      <w:r>
-        <w:rPr>
-          <w:color w:val="2C2C2A"/>
-          <w:sz w:val="22"/>
-        </w:rPr>
-        <w:t>Cascata: Nível 0 detectores (CPF/CNPJ/Luhn) → Nível 1 Qwen3 local (conteúdo não sai) → Nível 2 nuvem (só o resíduo). Cada captura grava classificado_por.</w:t>
+        <w:t>Subir o coletor</w:t>
       </w:r>
     </w:p>
     <w:p>
       <w:r>
         <w:rPr>
-          <w:rFonts w:ascii="Georgia" w:hAnsi="Georgia"/>
+          <w:b w:val="0"/>
+        </w:rPr>
+        <w:t>Na pasta do projeto, exposto à rede das estações:</w:t>
+      </w:r>
+    </w:p>
+    <w:p>
+      <w:pPr>
+        <w:ind w:left="160"/>
+      </w:pPr>
+      <w:r>
+        <w:rPr>
+          <w:rFonts w:ascii="Consolas" w:hAnsi="Consolas"/>
+          <w:b w:val="0"/>
+          <w:color w:val="143A2C"/>
+          <w:sz w:val="19"/>
+        </w:rPr>
+        <w:t>cd ~/Downloads/espia</w:t>
+      </w:r>
+      <w:r>
+        <w:rPr>
+          <w:color w:val="143A2C"/>
+        </w:rPr>
+        <w:br/>
+      </w:r>
+      <w:r>
+        <w:rPr>
+          <w:rFonts w:ascii="Consolas" w:hAnsi="Consolas"/>
+          <w:b w:val="0"/>
+          <w:color w:val="143A2C"/>
+          <w:sz w:val="19"/>
+        </w:rPr>
+        <w:t># processa a base e monta o painel (1ª vez)</w:t>
+      </w:r>
+      <w:r>
+        <w:rPr>
+          <w:color w:val="143A2C"/>
+        </w:rPr>
+        <w:br/>
+      </w:r>
+      <w:r>
+        <w:rPr>
+          <w:rFonts w:ascii="Consolas" w:hAnsi="Consolas"/>
+          <w:b w:val="0"/>
+          <w:color w:val="143A2C"/>
+          <w:sz w:val="19"/>
+        </w:rPr>
+        <w:t>python3 run.py gerar</w:t>
+      </w:r>
+      <w:r>
+        <w:rPr>
+          <w:color w:val="143A2C"/>
+        </w:rPr>
+        <w:br/>
+      </w:r>
+      <w:r>
+        <w:rPr>
+          <w:rFonts w:ascii="Consolas" w:hAnsi="Consolas"/>
+          <w:b w:val="0"/>
+          <w:color w:val="143A2C"/>
+          <w:sz w:val="19"/>
+        </w:rPr>
+        <w:t># sobe o coletor aberto à rede (recebe das estações)</w:t>
+      </w:r>
+      <w:r>
+        <w:rPr>
+          <w:color w:val="143A2C"/>
+        </w:rPr>
+        <w:br/>
+      </w:r>
+      <w:r>
+        <w:rPr>
+          <w:rFonts w:ascii="Consolas" w:hAnsi="Consolas"/>
+          <w:b w:val="0"/>
+          <w:color w:val="143A2C"/>
+          <w:sz w:val="19"/>
+        </w:rPr>
+        <w:t>ESPIA_BIND=0.0.0.0 python3 run.py coletor</w:t>
+      </w:r>
+    </w:p>
+    <w:p>
+      <w:r>
+        <w:rPr>
+          <w:b w:val="0"/>
+        </w:rPr>
+        <w:t xml:space="preserve">O painel fica em </w:t>
+      </w:r>
+      <w:r>
+        <w:rPr>
+          <w:rFonts w:ascii="Consolas" w:hAnsi="Consolas"/>
+          <w:b w:val="0"/>
+          <w:sz w:val="19"/>
+        </w:rPr>
+        <w:t>http://127.0.0.1:8765/</w:t>
+      </w:r>
+      <w:r>
+        <w:rPr>
+          <w:b w:val="0"/>
+        </w:rPr>
+        <w:t xml:space="preserve"> (local) e, das estações, no IP/nome que o startup imprime.</w:t>
+      </w:r>
+    </w:p>
+    <w:p>
+      <w:pPr>
+        <w:pStyle w:val="Heading2"/>
+      </w:pPr>
+      <w:r>
+        <w:rPr>
+          <w:b w:val="0"/>
+          <w:color w:val="1C6B4D"/>
+        </w:rPr>
+        <w:t>Instalar e subir o LLM local (Nível 1 · Qwen3)</w:t>
+      </w:r>
+    </w:p>
+    <w:p>
+      <w:pPr>
+        <w:ind w:left="160"/>
+      </w:pPr>
+      <w:r>
+        <w:rPr>
+          <w:rFonts w:ascii="Consolas" w:hAnsi="Consolas"/>
+          <w:b w:val="0"/>
+          <w:color w:val="143A2C"/>
+          <w:sz w:val="19"/>
+        </w:rPr>
+        <w:t xml:space="preserve">bash llm-local/instalar-llm-local.sh   </w:t>
+      </w:r>
+      <w:r>
+        <w:rPr>
+          <w:rFonts w:ascii="Consolas" w:hAnsi="Consolas"/>
+          <w:b w:val="0"/>
+          <w:color w:val="143A2C"/>
+          <w:sz w:val="19"/>
+        </w:rPr>
+        <w:t># baixa llamafile + Qwen3 (~2,7 GB)</w:t>
+      </w:r>
+      <w:r>
+        <w:rPr>
+          <w:color w:val="143A2C"/>
+        </w:rPr>
+        <w:br/>
+      </w:r>
+      <w:r>
+        <w:rPr>
+          <w:rFonts w:ascii="Consolas" w:hAnsi="Consolas"/>
+          <w:b w:val="0"/>
+          <w:color w:val="143A2C"/>
+          <w:sz w:val="19"/>
+        </w:rPr>
+        <w:t xml:space="preserve">bash llm-local/rodar-llm-local.sh      </w:t>
+      </w:r>
+      <w:r>
+        <w:rPr>
+          <w:rFonts w:ascii="Consolas" w:hAnsi="Consolas"/>
+          <w:b w:val="0"/>
+          <w:color w:val="143A2C"/>
+          <w:sz w:val="19"/>
+        </w:rPr>
+        <w:t># sobe o modelo em 127.0.0.1:8090</w:t>
+      </w:r>
+    </w:p>
+    <w:p>
+      <w:r>
+        <w:rPr>
+          <w:b w:val="0"/>
+        </w:rPr>
+        <w:t>O coletor encontra o modelo sozinho. Deixe os dois rodando (coletor + llamafile).</w:t>
+      </w:r>
+    </w:p>
+    <w:p>
+      <w:pPr>
+        <w:ind w:left="200"/>
+      </w:pPr>
+      <w:r>
+        <w:rPr>
           <w:b/>
-          <w:color w:val="0F3B2C"/>
-          <w:sz w:val="30"/>
+          <w:i/>
+          <w:color w:val="55605A"/>
+        </w:rPr>
+        <w:t>Cascata de classificação:</w:t>
+      </w:r>
+      <w:r>
+        <w:rPr>
+          <w:b w:val="0"/>
+          <w:i/>
+          <w:color w:val="55605A"/>
+        </w:rPr>
+        <w:t xml:space="preserve"> Nível 0 detectores (CPF/CNPJ/Luhn) → Nível 1 Qwen3 local (conteúdo não sai) → Nível 2 nuvem (só o resíduo). Cada captura grava </w:t>
+      </w:r>
+      <w:r>
+        <w:rPr>
+          <w:rFonts w:ascii="Consolas" w:hAnsi="Consolas"/>
+          <w:b w:val="0"/>
+          <w:i/>
+          <w:color w:val="55605A"/>
+          <w:sz w:val="19"/>
+        </w:rPr>
+        <w:t>classificado_por</w:t>
+      </w:r>
+      <w:r>
+        <w:rPr>
+          <w:b w:val="0"/>
+          <w:i/>
+          <w:color w:val="55605A"/>
+        </w:rPr>
+        <w:t>.</w:t>
+      </w:r>
+    </w:p>
+    <w:p>
+      <w:pPr>
+        <w:pStyle w:val="Heading1"/>
+      </w:pPr>
+      <w:r>
+        <w:rPr>
+          <w:b w:val="0"/>
+          <w:color w:val="1C3B2E"/>
         </w:rPr>
         <w:t>Parte B — Estação Windows · Agente (serviço)</w:t>
       </w:r>
     </w:p>
     <w:p>
       <w:pPr>
-        <w:spacing w:line="300" w:lineRule="auto"/>
+        <w:pStyle w:val="Heading2"/>
       </w:pPr>
       <w:r>
         <w:rPr>
-          <w:color w:val="2C2C2A"/>
-          <w:sz w:val="22"/>
+          <w:b w:val="0"/>
+          <w:color w:val="1C6B4D"/>
         </w:rPr>
-        <w:t>PowerShell como administrador:</w:t>
+        <w:t>Baixar, extrair e instalar (PowerShell como administrador)</w:t>
       </w:r>
     </w:p>
     <w:p>
       <w:pPr>
-        <w:shd w:val="clear" w:fill="0F3B2C"/>
+        <w:ind w:left="160"/>
       </w:pPr>
       <w:r>
         <w:rPr>
           <w:rFonts w:ascii="Consolas" w:hAnsi="Consolas"/>
-          <w:color w:val="EAF3EE"/>
+          <w:b w:val="0"/>
+          <w:color w:val="143A2C"/>
           <w:sz w:val="19"/>
         </w:rPr>
         <w:t>cd $env:USERPROFILE\Downloads</w:t>
-        <w:br/>
-        <w:t>Invoke-WebRequest "https://raw.githubusercontent.com/lucibad/espia-starkbank/main/borda/pacotes/GerencIA-Agente-Estacao.zip" -OutFile GerencIA.zip</w:t>
-        <w:br/>
-        <w:t>Expand-Archive GerencIA.zip -DestinationPath C:\GerencIA -Force</w:t>
-        <w:br/>
-        <w:t>cd C:\GerencIA\GerencIA-Agente-Estacao\servico</w:t>
-        <w:br/>
-        <w:t>powershell -ExecutionPolicy Bypass -File .\instalar-servico.ps1 -Coletor "http://10.211.55.2:8765" -Senha "UmaSenhaQueVoceLembre"</w:t>
       </w:r>
-    </w:p>
-    <w:p>
-      <w:pPr>
-        <w:spacing w:line="300" w:lineRule="auto"/>
-      </w:pPr>
       <w:r>
         <w:rPr>
-          <w:color w:val="2C2C2A"/>
-          <w:sz w:val="22"/>
+          <w:color w:val="143A2C"/>
         </w:rPr>
-        <w:t>Conferir: Get-Service GerenciaSensor — deve estar Running / Automatic. O agente registra uso real (~1×/dia por ferramenta), sem conteúdo. Esqueceu a senha? Como admin, .\resetar-senha.ps1 redefine sem a antiga.</w:t>
+        <w:br/>
+      </w:r>
+      <w:r>
+        <w:rPr>
+          <w:rFonts w:ascii="Consolas" w:hAnsi="Consolas"/>
+          <w:b w:val="0"/>
+          <w:color w:val="143A2C"/>
+          <w:sz w:val="19"/>
+        </w:rPr>
+        <w:t>Invoke-WebRequest "https://raw.githubusercontent.com/lucibad/espia-starkbank/main/borda/pacotes/GerencIA-Agente-Estacao.zip" -OutFile GerencIA.zip</w:t>
+      </w:r>
+      <w:r>
+        <w:rPr>
+          <w:color w:val="143A2C"/>
+        </w:rPr>
+        <w:br/>
+      </w:r>
+      <w:r>
+        <w:rPr>
+          <w:rFonts w:ascii="Consolas" w:hAnsi="Consolas"/>
+          <w:b w:val="0"/>
+          <w:color w:val="143A2C"/>
+          <w:sz w:val="19"/>
+        </w:rPr>
+        <w:t>Expand-Archive GerencIA.zip -DestinationPath C:\GerencIA -Force</w:t>
+      </w:r>
+      <w:r>
+        <w:rPr>
+          <w:color w:val="143A2C"/>
+        </w:rPr>
+        <w:br/>
+      </w:r>
+      <w:r>
+        <w:rPr>
+          <w:rFonts w:ascii="Consolas" w:hAnsi="Consolas"/>
+          <w:b w:val="0"/>
+          <w:color w:val="143A2C"/>
+          <w:sz w:val="19"/>
+        </w:rPr>
+        <w:t>cd C:\GerencIA\GerencIA-Agente-Estacao\servico</w:t>
+      </w:r>
+      <w:r>
+        <w:rPr>
+          <w:color w:val="143A2C"/>
+        </w:rPr>
+        <w:br/>
+      </w:r>
+      <w:r>
+        <w:rPr>
+          <w:rFonts w:ascii="Consolas" w:hAnsi="Consolas"/>
+          <w:b w:val="0"/>
+          <w:color w:val="143A2C"/>
+          <w:sz w:val="19"/>
+        </w:rPr>
+        <w:t>powershell -ExecutionPolicy Bypass -File .\instalar-servico.ps1 -Coletor "http://macbook-pro.local:8765" -Senha "UmaSenhaQueVoceLembre"</w:t>
       </w:r>
     </w:p>
     <w:p>
       <w:r>
         <w:rPr>
-          <w:rFonts w:ascii="Georgia" w:hAnsi="Georgia"/>
+          <w:b w:val="0"/>
+        </w:rPr>
+        <w:t xml:space="preserve">O instalador acha/instala o Python, registra o serviço (início automático), endurece a ACL, guarda a senha e adiciona uma </w:t>
+      </w:r>
+      <w:r>
+        <w:rPr>
           <w:b/>
-          <w:color w:val="0F3B2C"/>
-          <w:sz w:val="30"/>
+        </w:rPr>
+        <w:t>exclusão do Windows Defender</w:t>
+      </w:r>
+      <w:r>
+        <w:rPr>
+          <w:b w:val="0"/>
+        </w:rPr>
+        <w:t xml:space="preserve"> para a pasta — sem desligar a proteção.</w:t>
+      </w:r>
+    </w:p>
+    <w:p>
+      <w:pPr>
+        <w:pStyle w:val="Heading2"/>
+      </w:pPr>
+      <w:r>
+        <w:rPr>
+          <w:b w:val="0"/>
+          <w:color w:val="1C6B4D"/>
+        </w:rPr>
+        <w:t>Conferir</w:t>
+      </w:r>
+    </w:p>
+    <w:p>
+      <w:pPr>
+        <w:ind w:left="160"/>
+      </w:pPr>
+      <w:r>
+        <w:rPr>
+          <w:rFonts w:ascii="Consolas" w:hAnsi="Consolas"/>
+          <w:b w:val="0"/>
+          <w:color w:val="143A2C"/>
+          <w:sz w:val="19"/>
+        </w:rPr>
+        <w:t>Get-Service GerenciaSensor | Select-Object Name,Status,StartType</w:t>
+      </w:r>
+    </w:p>
+    <w:p>
+      <w:r>
+        <w:rPr>
+          <w:b w:val="0"/>
+        </w:rPr>
+        <w:t xml:space="preserve">Deve mostrar </w:t>
+      </w:r>
+      <w:r>
+        <w:rPr>
+          <w:b/>
+        </w:rPr>
+        <w:t>Running / Automatic</w:t>
+      </w:r>
+      <w:r>
+        <w:rPr>
+          <w:b w:val="0"/>
+        </w:rPr>
+        <w:t>. O agente registra uso real (~1×/dia por ferramenta), sem conteúdo.</w:t>
+      </w:r>
+    </w:p>
+    <w:p>
+      <w:pPr>
+        <w:ind w:left="200"/>
+      </w:pPr>
+      <w:r>
+        <w:rPr>
+          <w:b/>
+          <w:i/>
+          <w:color w:val="55605A"/>
+        </w:rPr>
+        <w:t>Guarde a senha.</w:t>
+      </w:r>
+      <w:r>
+        <w:rPr>
+          <w:b w:val="0"/>
+          <w:i/>
+          <w:color w:val="55605A"/>
+        </w:rPr>
+        <w:t xml:space="preserve"> Esqueceu? Como admin, </w:t>
+      </w:r>
+      <w:r>
+        <w:rPr>
+          <w:rFonts w:ascii="Consolas" w:hAnsi="Consolas"/>
+          <w:b w:val="0"/>
+          <w:i/>
+          <w:color w:val="55605A"/>
+          <w:sz w:val="19"/>
+        </w:rPr>
+        <w:t>.\resetar-senha.ps1</w:t>
+      </w:r>
+      <w:r>
+        <w:rPr>
+          <w:b w:val="0"/>
+          <w:i/>
+          <w:color w:val="55605A"/>
+        </w:rPr>
+        <w:t xml:space="preserve"> redefine sem precisar da antiga.</w:t>
+      </w:r>
+    </w:p>
+    <w:p>
+      <w:pPr>
+        <w:pStyle w:val="Heading1"/>
+      </w:pPr>
+      <w:r>
+        <w:rPr>
+          <w:b w:val="0"/>
+          <w:color w:val="1C3B2E"/>
         </w:rPr>
         <w:t>Parte C — Estação Windows · Extensão (conteúdo)</w:t>
       </w:r>
     </w:p>
     <w:p>
       <w:pPr>
-        <w:spacing w:line="300" w:lineRule="auto"/>
+        <w:pStyle w:val="Heading2"/>
       </w:pPr>
       <w:r>
         <w:rPr>
-          <w:color w:val="2C2C2A"/>
-          <w:sz w:val="22"/>
+          <w:b w:val="0"/>
+          <w:color w:val="1C6B4D"/>
         </w:rPr>
-        <w:t>1) Baixar e registrar (atualizador, por usuário — baixa, confere e registra o host nativo):</w:t>
-      </w:r>
-    </w:p>
-    <w:p>
-      <w:pPr>
-        <w:shd w:val="clear" w:fill="0F3B2C"/>
-      </w:pPr>
-      <w:r>
-        <w:rPr>
-          <w:rFonts w:ascii="Consolas" w:hAnsi="Consolas"/>
-          <w:color w:val="EAF3EE"/>
-          <w:sz w:val="19"/>
-        </w:rPr>
-        <w:t>cd $env:USERPROFILE\Downloads</w:t>
-        <w:br/>
-        <w:t>Invoke-WebRequest "https://raw.githubusercontent.com/lucibad/espia-starkbank/main/borda/extensao/ATUALIZAR-EXTENSAO.ps1" -OutFile ATUALIZAR-EXTENSAO.ps1</w:t>
-        <w:br/>
-        <w:t>powershell -ExecutionPolicy Bypass -File .\ATUALIZAR-EXTENSAO.ps1</w:t>
-      </w:r>
-    </w:p>
-    <w:p>
-      <w:pPr>
-        <w:pStyle w:val="ListBullet"/>
-      </w:pPr>
-      <w:r>
-        <w:rPr>
-          <w:b/>
-          <w:sz w:val="22"/>
-        </w:rPr>
-        <w:t xml:space="preserve">Edge/Chrome: </w:t>
-      </w:r>
-      <w:r>
-        <w:rPr>
-          <w:sz w:val="22"/>
-        </w:rPr>
-        <w:t>edge://extensions → Modo do desenvolvedor → Remover o antigo → Carregar sem pacote → C:\GerencIA\extensao (deve aparecer 0.2.2).</w:t>
-      </w:r>
-    </w:p>
-    <w:p>
-      <w:pPr>
-        <w:pStyle w:val="ListBullet"/>
-      </w:pPr>
-      <w:r>
-        <w:rPr>
-          <w:b/>
-          <w:sz w:val="22"/>
-        </w:rPr>
-        <w:t xml:space="preserve">Firefox: </w:t>
-      </w:r>
-      <w:r>
-        <w:rPr>
-          <w:sz w:val="22"/>
-        </w:rPr>
-        <w:t>about:debugging → Este Firefox → Carregar extensão temporária → C:\GerencIA\extensao\manifest.json. Depois, about:addons → Permissões → ligar o acesso aos sites (no Firefox a permissão de rede é manual).</w:t>
-      </w:r>
-    </w:p>
-    <w:p>
-      <w:pPr>
-        <w:spacing w:line="300" w:lineRule="auto"/>
-      </w:pPr>
-      <w:r>
-        <w:rPr>
-          <w:color w:val="2C2C2A"/>
-          <w:sz w:val="22"/>
-        </w:rPr>
-        <w:t>Feche e reabra o navegador e dê F5 na aba. No popup: Agente conectado e Usuário com o nome real. Identidade multiusuário: cada usuário roda o atualizador uma vez (ID da extensão é fixo).</w:t>
+        <w:t>Baixar e registrar (atualizador, por usuário)</w:t>
       </w:r>
     </w:p>
     <w:p>
       <w:r>
         <w:rPr>
-          <w:rFonts w:ascii="Georgia" w:hAnsi="Georgia"/>
+          <w:b w:val="0"/>
+        </w:rPr>
+        <w:t>O atualizador baixa a extensão, confere a build e registra o host nativo de identidade para o usuário logado:</w:t>
+      </w:r>
+    </w:p>
+    <w:p>
+      <w:pPr>
+        <w:ind w:left="160"/>
+      </w:pPr>
+      <w:r>
+        <w:rPr>
+          <w:rFonts w:ascii="Consolas" w:hAnsi="Consolas"/>
+          <w:b w:val="0"/>
+          <w:color w:val="143A2C"/>
+          <w:sz w:val="19"/>
+        </w:rPr>
+        <w:t>cd $env:USERPROFILE\Downloads</w:t>
+      </w:r>
+      <w:r>
+        <w:rPr>
+          <w:color w:val="143A2C"/>
+        </w:rPr>
+        <w:br/>
+      </w:r>
+      <w:r>
+        <w:rPr>
+          <w:rFonts w:ascii="Consolas" w:hAnsi="Consolas"/>
+          <w:b w:val="0"/>
+          <w:color w:val="143A2C"/>
+          <w:sz w:val="19"/>
+        </w:rPr>
+        <w:t>Invoke-WebRequest "https://raw.githubusercontent.com/lucibad/espia-starkbank/main/borda/extensao/ATUALIZAR-EXTENSAO.ps1" -OutFile ATUALIZAR-EXTENSAO.ps1</w:t>
+      </w:r>
+      <w:r>
+        <w:rPr>
+          <w:color w:val="143A2C"/>
+        </w:rPr>
+        <w:br/>
+      </w:r>
+      <w:r>
+        <w:rPr>
+          <w:rFonts w:ascii="Consolas" w:hAnsi="Consolas"/>
+          <w:b w:val="0"/>
+          <w:color w:val="143A2C"/>
+          <w:sz w:val="19"/>
+        </w:rPr>
+        <w:t>powershell -ExecutionPolicy Bypass -File .\ATUALIZAR-EXTENSAO.ps1</w:t>
+      </w:r>
+    </w:p>
+    <w:p>
+      <w:r>
+        <w:rPr>
+          <w:b w:val="0"/>
+        </w:rPr>
+        <w:t xml:space="preserve">Deve imprimir </w:t>
+      </w:r>
+      <w:r>
+        <w:rPr>
+          <w:rFonts w:ascii="Consolas" w:hAnsi="Consolas"/>
+          <w:b w:val="0"/>
+          <w:sz w:val="19"/>
+        </w:rPr>
+        <w:t>versao: 0.3.0</w:t>
+      </w:r>
+      <w:r>
+        <w:rPr>
+          <w:b w:val="0"/>
+        </w:rPr>
+        <w:t xml:space="preserve">, </w:t>
+      </w:r>
+      <w:r>
+        <w:rPr>
+          <w:rFonts w:ascii="Consolas" w:hAnsi="Consolas"/>
+          <w:b w:val="0"/>
+          <w:sz w:val="19"/>
+        </w:rPr>
+        <w:t>captura conteudo: SIM</w:t>
+      </w:r>
+      <w:r>
+        <w:rPr>
+          <w:b w:val="0"/>
+        </w:rPr>
+        <w:t>.</w:t>
+      </w:r>
+    </w:p>
+    <w:p>
+      <w:pPr>
+        <w:pStyle w:val="Heading2"/>
+      </w:pPr>
+      <w:r>
+        <w:rPr>
+          <w:b w:val="0"/>
+          <w:color w:val="1C6B4D"/>
+        </w:rPr>
+        <w:t>Carregar no navegador</w:t>
+      </w:r>
+    </w:p>
+    <w:p>
+      <w:r>
+        <w:rPr>
           <w:b/>
-          <w:color w:val="0F3B2C"/>
-          <w:sz w:val="30"/>
+        </w:rPr>
+        <w:t>Edge/Chrome:</w:t>
+      </w:r>
+      <w:r>
+        <w:rPr>
+          <w:b w:val="0"/>
+        </w:rPr>
+        <w:t xml:space="preserve"> </w:t>
+      </w:r>
+      <w:r>
+        <w:rPr>
+          <w:rFonts w:ascii="Consolas" w:hAnsi="Consolas"/>
+          <w:b w:val="0"/>
+          <w:sz w:val="19"/>
+        </w:rPr>
+        <w:t>edge://extensions</w:t>
+      </w:r>
+      <w:r>
+        <w:rPr>
+          <w:b w:val="0"/>
+        </w:rPr>
+        <w:t xml:space="preserve"> → Modo do desenvolvedor → Remover o antigo → </w:t>
+      </w:r>
+      <w:r>
+        <w:rPr>
+          <w:b/>
+        </w:rPr>
+        <w:t>Carregar sem pacote</w:t>
+      </w:r>
+      <w:r>
+        <w:rPr>
+          <w:b w:val="0"/>
+        </w:rPr>
+        <w:t xml:space="preserve"> → </w:t>
+      </w:r>
+      <w:r>
+        <w:rPr>
+          <w:rFonts w:ascii="Consolas" w:hAnsi="Consolas"/>
+          <w:b w:val="0"/>
+          <w:sz w:val="19"/>
+        </w:rPr>
+        <w:t>C:\GerencIA\extensao</w:t>
+      </w:r>
+      <w:r>
+        <w:rPr>
+          <w:b w:val="0"/>
+        </w:rPr>
+        <w:t xml:space="preserve"> (deve aparecer </w:t>
+      </w:r>
+      <w:r>
+        <w:rPr>
+          <w:b/>
+        </w:rPr>
+        <w:t>0.3.0</w:t>
+      </w:r>
+      <w:r>
+        <w:rPr>
+          <w:b w:val="0"/>
+        </w:rPr>
+        <w:t>).</w:t>
+      </w:r>
+    </w:p>
+    <w:p>
+      <w:r>
+        <w:rPr>
+          <w:b/>
+        </w:rPr>
+        <w:t>Firefox:</w:t>
+      </w:r>
+      <w:r>
+        <w:rPr>
+          <w:b w:val="0"/>
+        </w:rPr>
+        <w:t xml:space="preserve"> </w:t>
+      </w:r>
+      <w:r>
+        <w:rPr>
+          <w:rFonts w:ascii="Consolas" w:hAnsi="Consolas"/>
+          <w:b w:val="0"/>
+          <w:sz w:val="19"/>
+        </w:rPr>
+        <w:t>about:debugging</w:t>
+      </w:r>
+      <w:r>
+        <w:rPr>
+          <w:b w:val="0"/>
+        </w:rPr>
+        <w:t xml:space="preserve"> → Este Firefox → </w:t>
+      </w:r>
+      <w:r>
+        <w:rPr>
+          <w:b/>
+        </w:rPr>
+        <w:t>Carregar extensão temporária</w:t>
+      </w:r>
+      <w:r>
+        <w:rPr>
+          <w:b w:val="0"/>
+        </w:rPr>
+        <w:t xml:space="preserve"> → selecione </w:t>
+      </w:r>
+      <w:r>
+        <w:rPr>
+          <w:rFonts w:ascii="Consolas" w:hAnsi="Consolas"/>
+          <w:b w:val="0"/>
+          <w:sz w:val="19"/>
+        </w:rPr>
+        <w:t>C:\GerencIA\extensao\manifest.json</w:t>
+      </w:r>
+      <w:r>
+        <w:rPr>
+          <w:b w:val="0"/>
+        </w:rPr>
+        <w:t xml:space="preserve">. Depois, em </w:t>
+      </w:r>
+      <w:r>
+        <w:rPr>
+          <w:rFonts w:ascii="Consolas" w:hAnsi="Consolas"/>
+          <w:b w:val="0"/>
+          <w:sz w:val="19"/>
+        </w:rPr>
+        <w:t>about:addons</w:t>
+      </w:r>
+      <w:r>
+        <w:rPr>
+          <w:b w:val="0"/>
+        </w:rPr>
+        <w:t xml:space="preserve"> → Permissões → </w:t>
+      </w:r>
+      <w:r>
+        <w:rPr>
+          <w:b/>
+        </w:rPr>
+        <w:t>ligue</w:t>
+      </w:r>
+      <w:r>
+        <w:rPr>
+          <w:b w:val="0"/>
+        </w:rPr>
+        <w:t xml:space="preserve"> o acesso aos sites (no Firefox a permissão de rede é manual).</w:t>
+      </w:r>
+    </w:p>
+    <w:p>
+      <w:pPr>
+        <w:pStyle w:val="Heading2"/>
+      </w:pPr>
+      <w:r>
+        <w:rPr>
+          <w:b w:val="0"/>
+          <w:color w:val="1C6B4D"/>
+        </w:rPr>
+        <w:t>Confirmar e testar</w:t>
+      </w:r>
+    </w:p>
+    <w:p>
+      <w:r>
+        <w:rPr>
+          <w:b/>
+        </w:rPr>
+        <w:t>Feche e reabra o navegador</w:t>
+      </w:r>
+      <w:r>
+        <w:rPr>
+          <w:b w:val="0"/>
+        </w:rPr>
+        <w:t xml:space="preserve"> (para reler o host nativo) e dê </w:t>
+      </w:r>
+      <w:r>
+        <w:rPr>
+          <w:b/>
+        </w:rPr>
+        <w:t>F5</w:t>
+      </w:r>
+      <w:r>
+        <w:rPr>
+          <w:b w:val="0"/>
+        </w:rPr>
+        <w:t xml:space="preserve"> na aba da IA. No popup da extensão: </w:t>
+      </w:r>
+      <w:r>
+        <w:rPr>
+          <w:b/>
+        </w:rPr>
+        <w:t>Agente conectado</w:t>
+      </w:r>
+      <w:r>
+        <w:rPr>
+          <w:b w:val="0"/>
+        </w:rPr>
+        <w:t xml:space="preserve"> e </w:t>
+      </w:r>
+      <w:r>
+        <w:rPr>
+          <w:b/>
+        </w:rPr>
+        <w:t>Usuário</w:t>
+      </w:r>
+      <w:r>
+        <w:rPr>
+          <w:b w:val="0"/>
+        </w:rPr>
+        <w:t xml:space="preserve"> com o nome real. Faça uma busca no ChatGPT e veja o conteúdo no painel → </w:t>
+      </w:r>
+      <w:r>
+        <w:rPr>
+          <w:b/>
+        </w:rPr>
+        <w:t>Captura → Conteúdo capturado</w:t>
+      </w:r>
+      <w:r>
+        <w:rPr>
+          <w:b w:val="0"/>
+        </w:rPr>
+        <w:t>.</w:t>
+      </w:r>
+    </w:p>
+    <w:p>
+      <w:pPr>
+        <w:ind w:left="200"/>
+      </w:pPr>
+      <w:r>
+        <w:rPr>
+          <w:b/>
+          <w:i/>
+          <w:color w:val="55605A"/>
+        </w:rPr>
+        <w:t>Identidade multiusuário:</w:t>
+      </w:r>
+      <w:r>
+        <w:rPr>
+          <w:b w:val="0"/>
+          <w:i/>
+          <w:color w:val="55605A"/>
+        </w:rPr>
+        <w:t xml:space="preserve"> o ID da extensão é fixo (chave no manifesto). Cada usuário do Windows roda o </w:t>
+      </w:r>
+      <w:r>
+        <w:rPr>
+          <w:rFonts w:ascii="Consolas" w:hAnsi="Consolas"/>
+          <w:b w:val="0"/>
+          <w:i/>
+          <w:color w:val="55605A"/>
+          <w:sz w:val="19"/>
+        </w:rPr>
+        <w:t>ATUALIZAR-EXTENSAO.ps1</w:t>
+      </w:r>
+      <w:r>
+        <w:rPr>
+          <w:b w:val="0"/>
+          <w:i/>
+          <w:color w:val="55605A"/>
+        </w:rPr>
+        <w:t xml:space="preserve"> uma vez (registra o host nativo no perfil dele) — e aparece com o próprio nome.</w:t>
+      </w:r>
+    </w:p>
+    <w:p>
+      <w:pPr>
+        <w:pStyle w:val="Heading1"/>
+      </w:pPr>
+      <w:r>
+        <w:rPr>
+          <w:b w:val="0"/>
+          <w:color w:val="1C3B2E"/>
         </w:rPr>
         <w:t>Verificação de ponta a ponta</w:t>
       </w:r>
@@ -746,16 +1431,69 @@
       </w:pPr>
       <w:r>
         <w:rPr>
-          <w:b/>
-          <w:sz w:val="22"/>
+          <w:b w:val="0"/>
         </w:rPr>
-        <w:t xml:space="preserve">Painel → Captura: </w:t>
+        <w:t xml:space="preserve">Painel → </w:t>
       </w:r>
       <w:r>
         <w:rPr>
-          <w:sz w:val="22"/>
+          <w:b/>
         </w:rPr>
-        <w:t>tabela Usuário × IA com Origem (Extensão/Agente), Classificação (Detectores/Qwen3) e o vínculo prompt + resposta.</w:t>
+        <w:t>Captura</w:t>
+      </w:r>
+      <w:r>
+        <w:rPr>
+          <w:b w:val="0"/>
+        </w:rPr>
+        <w:t xml:space="preserve">: a tabela </w:t>
+      </w:r>
+      <w:r>
+        <w:rPr>
+          <w:b/>
+        </w:rPr>
+        <w:t>Usuário × IA</w:t>
+      </w:r>
+      <w:r>
+        <w:rPr>
+          <w:b w:val="0"/>
+        </w:rPr>
+        <w:t xml:space="preserve"> mostra a busca, com </w:t>
+      </w:r>
+      <w:r>
+        <w:rPr>
+          <w:b/>
+        </w:rPr>
+        <w:t>Origem</w:t>
+      </w:r>
+      <w:r>
+        <w:rPr>
+          <w:b w:val="0"/>
+        </w:rPr>
+        <w:t xml:space="preserve"> (Extensão/Agente), </w:t>
+      </w:r>
+      <w:r>
+        <w:rPr>
+          <w:b/>
+        </w:rPr>
+        <w:t>Classificação</w:t>
+      </w:r>
+      <w:r>
+        <w:rPr>
+          <w:b w:val="0"/>
+        </w:rPr>
+        <w:t xml:space="preserve"> (Detectores/Qwen3) e o vínculo </w:t>
+      </w:r>
+      <w:r>
+        <w:rPr>
+          <w:b/>
+        </w:rPr>
+        <w:t>↔ prompt + resposta</w:t>
+      </w:r>
+      <w:r>
+        <w:rPr>
+          <w:b w:val="0"/>
+        </w:rPr>
+        <w:t>.</w:t>
       </w:r>
     </w:p>
     <w:p>
@@ -764,16 +1502,21 @@
       </w:pPr>
       <w:r>
         <w:rPr>
-          <w:b/>
-          <w:sz w:val="22"/>
+          <w:b w:val="0"/>
         </w:rPr>
-        <w:t xml:space="preserve">Card Conteúdo capturado: </w:t>
+        <w:t xml:space="preserve">Card </w:t>
       </w:r>
       <w:r>
         <w:rPr>
-          <w:sz w:val="22"/>
+          <w:b/>
         </w:rPr>
-        <w:t>o texto digitado e a resposta da IA.</w:t>
+        <w:t>Conteúdo capturado</w:t>
+      </w:r>
+      <w:r>
+        <w:rPr>
+          <w:b w:val="0"/>
+        </w:rPr>
+        <w:t>: o texto digitado e a resposta da IA.</w:t>
       </w:r>
     </w:p>
     <w:p>
@@ -782,27 +1525,80 @@
       </w:pPr>
       <w:r>
         <w:rPr>
-          <w:b/>
-          <w:sz w:val="22"/>
+          <w:b w:val="0"/>
         </w:rPr>
-        <w:t xml:space="preserve">Vista Rastrear: </w:t>
+        <w:t xml:space="preserve">Vista </w:t>
       </w:r>
       <w:r>
         <w:rPr>
-          <w:sz w:val="22"/>
+          <w:b/>
         </w:rPr>
-        <w:t>busca reversa da informação.</w:t>
+        <w:t>Rastrear</w:t>
+      </w:r>
+      <w:r>
+        <w:rPr>
+          <w:b w:val="0"/>
+        </w:rPr>
+        <w:t>: busca reversa da informação.</w:t>
       </w:r>
     </w:p>
     <w:p>
+      <w:pPr>
+        <w:pStyle w:val="ListBullet"/>
+      </w:pPr>
       <w:r>
         <w:rPr>
-          <w:rFonts w:ascii="Georgia" w:hAnsi="Georgia"/>
+          <w:b w:val="0"/>
+        </w:rPr>
+        <w:t xml:space="preserve">Painel → </w:t>
+      </w:r>
+      <w:r>
+        <w:rPr>
           <w:b/>
-          <w:color w:val="0F3B2C"/>
-          <w:sz w:val="30"/>
         </w:rPr>
-        <w:t>Solução de problemas (casos reais)</w:t>
+        <w:t>Governança → Estações</w:t>
+      </w:r>
+      <w:r>
+        <w:rPr>
+          <w:b w:val="0"/>
+        </w:rPr>
+        <w:t xml:space="preserve">: cada máquina conectada com o </w:t>
+      </w:r>
+      <w:r>
+        <w:rPr>
+          <w:b/>
+        </w:rPr>
+        <w:t>farol</w:t>
+      </w:r>
+      <w:r>
+        <w:rPr>
+          <w:b w:val="0"/>
+        </w:rPr>
+        <w:t xml:space="preserve"> do agente e da extensão (verde = no ar) e alerta de </w:t>
+      </w:r>
+      <w:r>
+        <w:rPr>
+          <w:b/>
+        </w:rPr>
+        <w:t>extensão desabilitada</w:t>
+      </w:r>
+      <w:r>
+        <w:rPr>
+          <w:b w:val="0"/>
+        </w:rPr>
+        <w:t>.</w:t>
+      </w:r>
+    </w:p>
+    <w:p>
+      <w:pPr>
+        <w:pStyle w:val="Heading1"/>
+      </w:pPr>
+      <w:r>
+        <w:rPr>
+          <w:b w:val="0"/>
+          <w:color w:val="1C3B2E"/>
+        </w:rPr>
+        <w:t>Solução de problemas (os casos reais)</w:t>
       </w:r>
     </w:p>
     <w:tbl>
@@ -812,21 +1608,19 @@
         <w:tblLook w:firstColumn="1" w:firstRow="1" w:lastColumn="0" w:lastRow="0" w:noHBand="0" w:noVBand="1" w:val="04A0"/>
       </w:tblPr>
       <w:tblGrid>
-        <w:gridCol w:w="4680"/>
-        <w:gridCol w:w="4680"/>
+        <w:gridCol w:w="4320"/>
+        <w:gridCol w:w="4320"/>
       </w:tblGrid>
       <w:tr>
         <w:tc>
           <w:tcPr>
-            <w:tcW w:type="dxa" w:w="4680"/>
+            <w:tcW w:type="dxa" w:w="4320"/>
           </w:tcPr>
           <w:p>
             <w:r/>
             <w:r>
               <w:rPr>
-                <w:b/>
-                <w:color w:val="0F3B2C"/>
-                <w:sz w:val="19"/>
+                <w:b w:val="0"/>
               </w:rPr>
               <w:t>Sintoma</w:t>
             </w:r>
@@ -834,15 +1628,13 @@
         </w:tc>
         <w:tc>
           <w:tcPr>
-            <w:tcW w:type="dxa" w:w="4680"/>
+            <w:tcW w:type="dxa" w:w="4320"/>
           </w:tcPr>
           <w:p>
             <w:r/>
             <w:r>
               <w:rPr>
-                <w:b/>
-                <w:color w:val="0F3B2C"/>
-                <w:sz w:val="19"/>
+                <w:b w:val="0"/>
               </w:rPr>
               <w:t>Causa / solução</w:t>
             </w:r>
@@ -852,13 +1644,13 @@
       <w:tr>
         <w:tc>
           <w:tcPr>
-            <w:tcW w:type="dxa" w:w="4680"/>
+            <w:tcW w:type="dxa" w:w="4320"/>
           </w:tcPr>
           <w:p>
             <w:r/>
             <w:r>
               <w:rPr>
-                <w:sz w:val="19"/>
+                <w:b w:val="0"/>
               </w:rPr>
               <w:t>“Python was not found” (abre a Store)</w:t>
             </w:r>
@@ -866,15 +1658,15 @@
         </w:tc>
         <w:tc>
           <w:tcPr>
-            <w:tcW w:type="dxa" w:w="4680"/>
+            <w:tcW w:type="dxa" w:w="4320"/>
           </w:tcPr>
           <w:p>
             <w:r/>
             <w:r>
               <w:rPr>
-                <w:sz w:val="19"/>
+                <w:b w:val="0"/>
               </w:rPr>
-              <w:t>Atalho falso da Store. O instalador baixa o Python do python.org; ou instale manualmente.</w:t>
+              <w:t>É o atalho falso da Store. O instalador baixa o Python do python.org; ou instale manualmente e rode de novo.</w:t>
             </w:r>
           </w:p>
         </w:tc>
@@ -882,29 +1674,43 @@
       <w:tr>
         <w:tc>
           <w:tcPr>
-            <w:tcW w:type="dxa" w:w="4680"/>
+            <w:tcW w:type="dxa" w:w="4320"/>
           </w:tcPr>
           <w:p>
             <w:r/>
             <w:r>
               <w:rPr>
-                <w:sz w:val="19"/>
+                <w:b w:val="0"/>
               </w:rPr>
-              <w:t>“execução de scripts foi desabilitada”</w:t>
+              <w:t>“a execução de scripts foi desabilitada”</w:t>
             </w:r>
           </w:p>
         </w:tc>
         <w:tc>
           <w:tcPr>
-            <w:tcW w:type="dxa" w:w="4680"/>
+            <w:tcW w:type="dxa" w:w="4320"/>
           </w:tcPr>
           <w:p>
             <w:r/>
             <w:r>
               <w:rPr>
+                <w:b w:val="0"/>
+              </w:rPr>
+              <w:t xml:space="preserve">Rode com </w:t>
+            </w:r>
+            <w:r>
+              <w:rPr>
+                <w:rFonts w:ascii="Consolas" w:hAnsi="Consolas"/>
+                <w:b w:val="0"/>
                 <w:sz w:val="19"/>
               </w:rPr>
-              <w:t>Rode com powershell -ExecutionPolicy Bypass -File … (o INSTALAR.bat já faz).</w:t>
+              <w:t>powershell -ExecutionPolicy Bypass -File …</w:t>
+            </w:r>
+            <w:r>
+              <w:rPr>
+                <w:b w:val="0"/>
+              </w:rPr>
+              <w:t xml:space="preserve"> (o INSTALAR.bat já faz isso).</w:t>
             </w:r>
           </w:p>
         </w:tc>
@@ -912,29 +1718,29 @@
       <w:tr>
         <w:tc>
           <w:tcPr>
-            <w:tcW w:type="dxa" w:w="4680"/>
+            <w:tcW w:type="dxa" w:w="4320"/>
           </w:tcPr>
           <w:p>
             <w:r/>
             <w:r>
               <w:rPr>
-                <w:sz w:val="19"/>
+                <w:b w:val="0"/>
               </w:rPr>
-              <w:t>IdentityNotMappedException na instalação</w:t>
+              <w:t>“IdentityNotMappedException” na instalação</w:t>
             </w:r>
           </w:p>
         </w:tc>
         <w:tc>
           <w:tcPr>
-            <w:tcW w:type="dxa" w:w="4680"/>
+            <w:tcW w:type="dxa" w:w="4320"/>
           </w:tcPr>
           <w:p>
             <w:r/>
             <w:r>
               <w:rPr>
-                <w:sz w:val="19"/>
+                <w:b w:val="0"/>
               </w:rPr>
-              <w:t>Windows em pt-BR — corrigido (ACL por SID). Use o pacote atual.</w:t>
+              <w:t>Windows em português — já corrigido (ACL por SID). Use o pacote atual.</w:t>
             </w:r>
           </w:p>
         </w:tc>
@@ -942,29 +1748,57 @@
       <w:tr>
         <w:tc>
           <w:tcPr>
-            <w:tcW w:type="dxa" w:w="4680"/>
+            <w:tcW w:type="dxa" w:w="4320"/>
           </w:tcPr>
           <w:p>
             <w:r/>
             <w:r>
               <w:rPr>
+                <w:b w:val="0"/>
+              </w:rPr>
+              <w:t xml:space="preserve">Rodou de </w:t>
+            </w:r>
+            <w:r>
+              <w:rPr>
+                <w:rFonts w:ascii="Consolas" w:hAnsi="Consolas"/>
+                <w:b w:val="0"/>
                 <w:sz w:val="19"/>
               </w:rPr>
-              <w:t>Rodou de \\Mac\Home e o serviço não sobe no boot</w:t>
+              <w:t>\\Mac\Home</w:t>
+            </w:r>
+            <w:r>
+              <w:rPr>
+                <w:b w:val="0"/>
+              </w:rPr>
+              <w:t xml:space="preserve"> e o serviço não sobe no boot</w:t>
             </w:r>
           </w:p>
         </w:tc>
         <w:tc>
           <w:tcPr>
-            <w:tcW w:type="dxa" w:w="4680"/>
+            <w:tcW w:type="dxa" w:w="4320"/>
           </w:tcPr>
           <w:p>
             <w:r/>
             <w:r>
               <w:rPr>
+                <w:b w:val="0"/>
+              </w:rPr>
+              <w:t xml:space="preserve">Precisa de caminho local — o INSTALAR.bat copia para </w:t>
+            </w:r>
+            <w:r>
+              <w:rPr>
+                <w:rFonts w:ascii="Consolas" w:hAnsi="Consolas"/>
+                <w:b w:val="0"/>
                 <w:sz w:val="19"/>
               </w:rPr>
-              <w:t>Precisa de caminho local — o INSTALAR.bat copia para C:\GerencIA.</w:t>
+              <w:t>C:\GerencIA</w:t>
+            </w:r>
+            <w:r>
+              <w:rPr>
+                <w:b w:val="0"/>
+              </w:rPr>
+              <w:t xml:space="preserve"> automaticamente.</w:t>
             </w:r>
           </w:p>
         </w:tc>
@@ -972,29 +1806,43 @@
       <w:tr>
         <w:tc>
           <w:tcPr>
-            <w:tcW w:type="dxa" w:w="4680"/>
+            <w:tcW w:type="dxa" w:w="4320"/>
           </w:tcPr>
           <w:p>
             <w:r/>
             <w:r>
               <w:rPr>
-                <w:sz w:val="19"/>
+                <w:b w:val="0"/>
               </w:rPr>
-              <w:t>Extensão “Usuário não identificado”</w:t>
+              <w:t>Extensão: “Usuário não identificado”</w:t>
             </w:r>
           </w:p>
         </w:tc>
         <w:tc>
           <w:tcPr>
-            <w:tcW w:type="dxa" w:w="4680"/>
+            <w:tcW w:type="dxa" w:w="4320"/>
           </w:tcPr>
           <w:p>
             <w:r/>
             <w:r>
               <w:rPr>
+                <w:b w:val="0"/>
+              </w:rPr>
+              <w:t xml:space="preserve">Host nativo não registrado para o ID. Rode o </w:t>
+            </w:r>
+            <w:r>
+              <w:rPr>
+                <w:rFonts w:ascii="Consolas" w:hAnsi="Consolas"/>
+                <w:b w:val="0"/>
                 <w:sz w:val="19"/>
               </w:rPr>
-              <w:t>Host nativo não registrado. Rode o ATUALIZAR-EXTENSAO.ps1 e reabra o navegador.</w:t>
+              <w:t>ATUALIZAR-EXTENSAO.ps1</w:t>
+            </w:r>
+            <w:r>
+              <w:rPr>
+                <w:b w:val="0"/>
+              </w:rPr>
+              <w:t xml:space="preserve"> e reabra o navegador.</w:t>
             </w:r>
           </w:p>
         </w:tc>
@@ -1002,29 +1850,43 @@
       <w:tr>
         <w:tc>
           <w:tcPr>
-            <w:tcW w:type="dxa" w:w="4680"/>
+            <w:tcW w:type="dxa" w:w="4320"/>
           </w:tcPr>
           <w:p>
             <w:r/>
             <w:r>
               <w:rPr>
-                <w:sz w:val="19"/>
+                <w:b w:val="0"/>
               </w:rPr>
-              <w:t>Firefox “Agente sem conexão”</w:t>
+              <w:t>Firefox: “Agente sem conexão”</w:t>
             </w:r>
           </w:p>
         </w:tc>
         <w:tc>
           <w:tcPr>
-            <w:tcW w:type="dxa" w:w="4680"/>
+            <w:tcW w:type="dxa" w:w="4320"/>
           </w:tcPr>
           <w:p>
             <w:r/>
             <w:r>
               <w:rPr>
+                <w:b w:val="0"/>
+              </w:rPr>
+              <w:t xml:space="preserve">Permissão de rede do Firefox é manual: </w:t>
+            </w:r>
+            <w:r>
+              <w:rPr>
+                <w:rFonts w:ascii="Consolas" w:hAnsi="Consolas"/>
+                <w:b w:val="0"/>
                 <w:sz w:val="19"/>
               </w:rPr>
-              <w:t>Permissão de rede manual: about:addons → Permissões → ligar acesso aos sites.</w:t>
+              <w:t>about:addons</w:t>
+            </w:r>
+            <w:r>
+              <w:rPr>
+                <w:b w:val="0"/>
+              </w:rPr>
+              <w:t xml:space="preserve"> → Permissões → ligar acesso aos sites.</w:t>
             </w:r>
           </w:p>
         </w:tc>
@@ -1032,13 +1894,13 @@
       <w:tr>
         <w:tc>
           <w:tcPr>
-            <w:tcW w:type="dxa" w:w="4680"/>
+            <w:tcW w:type="dxa" w:w="4320"/>
           </w:tcPr>
           <w:p>
             <w:r/>
             <w:r>
               <w:rPr>
-                <w:sz w:val="19"/>
+                <w:b w:val="0"/>
               </w:rPr>
               <w:t>Agente gerando centenas de capturas/dia</w:t>
             </w:r>
@@ -1046,15 +1908,15 @@
         </w:tc>
         <w:tc>
           <w:tcPr>
-            <w:tcW w:type="dxa" w:w="4680"/>
+            <w:tcW w:type="dxa" w:w="4320"/>
           </w:tcPr>
           <w:p>
             <w:r/>
             <w:r>
               <w:rPr>
-                <w:sz w:val="19"/>
+                <w:b w:val="0"/>
               </w:rPr>
-              <w:t>Versão antiga. Reinstale: dedup 8h + cache de DNS como autoridade.</w:t>
+              <w:t>Versão antiga. Reinstale: dedup por uso (8h) + cache de DNS como autoridade (sem falso-positivo de CDN).</w:t>
             </w:r>
           </w:p>
         </w:tc>
@@ -1062,13 +1924,13 @@
       <w:tr>
         <w:tc>
           <w:tcPr>
-            <w:tcW w:type="dxa" w:w="4680"/>
+            <w:tcW w:type="dxa" w:w="4320"/>
           </w:tcPr>
           <w:p>
             <w:r/>
             <w:r>
               <w:rPr>
-                <w:sz w:val="19"/>
+                <w:b w:val="0"/>
               </w:rPr>
               <w:t>Esqueci a senha do serviço</w:t>
             </w:r>
@@ -1076,41 +1938,117 @@
         </w:tc>
         <w:tc>
           <w:tcPr>
-            <w:tcW w:type="dxa" w:w="4680"/>
+            <w:tcW w:type="dxa" w:w="4320"/>
           </w:tcPr>
           <w:p>
             <w:r/>
             <w:r>
               <w:rPr>
+                <w:rFonts w:ascii="Consolas" w:hAnsi="Consolas"/>
+                <w:b w:val="0"/>
                 <w:sz w:val="19"/>
               </w:rPr>
-              <w:t>.\resetar-senha.ps1 (admin, sem a antiga) ou sc delete GerenciaSensor e reinstale.</w:t>
+              <w:t>.\resetar-senha.ps1</w:t>
+            </w:r>
+            <w:r>
+              <w:rPr>
+                <w:b w:val="0"/>
+              </w:rPr>
+              <w:t xml:space="preserve"> (como admin, sem a antiga) ou </w:t>
+            </w:r>
+            <w:r>
+              <w:rPr>
+                <w:rFonts w:ascii="Consolas" w:hAnsi="Consolas"/>
+                <w:b w:val="0"/>
+                <w:sz w:val="19"/>
+              </w:rPr>
+              <w:t>sc delete GerenciaSensor</w:t>
+            </w:r>
+            <w:r>
+              <w:rPr>
+                <w:b w:val="0"/>
+              </w:rPr>
+              <w:t xml:space="preserve"> e reinstale.</w:t>
+            </w:r>
+          </w:p>
+        </w:tc>
+      </w:tr>
+      <w:tr>
+        <w:tc>
+          <w:tcPr>
+            <w:tcW w:type="dxa" w:w="4320"/>
+          </w:tcPr>
+          <w:p>
+            <w:r/>
+            <w:r>
+              <w:rPr>
+                <w:b w:val="0"/>
+              </w:rPr>
+              <w:t>Estações: farol “Sem sinal” com tudo instalado</w:t>
+            </w:r>
+          </w:p>
+        </w:tc>
+        <w:tc>
+          <w:tcPr>
+            <w:tcW w:type="dxa" w:w="4320"/>
+          </w:tcPr>
+          <w:p>
+            <w:r/>
+            <w:r>
+              <w:rPr>
+                <w:b w:val="0"/>
+              </w:rPr>
+              <w:t>Versões antigas não enviam heartbeat. Atualize o agente e a extensão para a build atual (</w:t>
+            </w:r>
+            <w:r>
+              <w:rPr>
+                <w:b/>
+              </w:rPr>
+              <w:t>0.3.0</w:t>
+            </w:r>
+            <w:r>
+              <w:rPr>
+                <w:b w:val="0"/>
+              </w:rPr>
+              <w:t>) — o farol acende em ~1 min.</w:t>
             </w:r>
           </w:p>
         </w:tc>
       </w:tr>
     </w:tbl>
+    <w:p/>
     <w:p>
+      <w:pPr>
+        <w:pStyle w:val="Heading1"/>
+      </w:pPr>
       <w:r>
         <w:rPr>
-          <w:rFonts w:ascii="Georgia" w:hAnsi="Georgia"/>
-          <w:b/>
-          <w:color w:val="0F3B2C"/>
-          <w:sz w:val="30"/>
+          <w:b w:val="0"/>
+          <w:color w:val="1C3B2E"/>
         </w:rPr>
         <w:t>Implantação em massa (GPO / Intune)</w:t>
       </w:r>
     </w:p>
     <w:p>
-      <w:pPr>
-        <w:spacing w:line="300" w:lineRule="auto"/>
-      </w:pPr>
       <w:r>
         <w:rPr>
-          <w:color w:val="2C2C2A"/>
-          <w:sz w:val="22"/>
+          <w:b w:val="0"/>
         </w:rPr>
-        <w:t>Para muitas estações, use a pasta deploy/ do pacote do agente (instalação silenciosa):</w:t>
+        <w:t xml:space="preserve">Para muitas estações, use a pasta </w:t>
+      </w:r>
+      <w:r>
+        <w:rPr>
+          <w:rFonts w:ascii="Consolas" w:hAnsi="Consolas"/>
+          <w:b w:val="0"/>
+          <w:sz w:val="19"/>
+        </w:rPr>
+        <w:t>deploy/</w:t>
+      </w:r>
+      <w:r>
+        <w:rPr>
+          <w:b w:val="0"/>
+        </w:rPr>
+        <w:t xml:space="preserve"> do pacote do agente (instalação silenciosa):</w:t>
       </w:r>
     </w:p>
     <w:p>
@@ -1119,16 +2057,17 @@
       </w:pPr>
       <w:r>
         <w:rPr>
-          <w:b/>
-          <w:sz w:val="22"/>
+          <w:rFonts w:ascii="Consolas" w:hAnsi="Consolas"/>
+          <w:b w:val="0"/>
+          <w:sz w:val="19"/>
         </w:rPr>
-        <w:t xml:space="preserve">gerar-hash-senha.ps1: </w:t>
+        <w:t>gerar-hash-senha.ps1</w:t>
       </w:r>
       <w:r>
         <w:rPr>
-          <w:sz w:val="22"/>
+          <w:b w:val="0"/>
         </w:rPr>
-        <w:t>pré-hasheia a senha (não trafega em texto).</w:t>
+        <w:t xml:space="preserve"> — pré-hasheia a senha (não trafega em texto).</w:t>
       </w:r>
     </w:p>
     <w:p>
@@ -1137,16 +2076,31 @@
       </w:pPr>
       <w:r>
         <w:rPr>
-          <w:b/>
-          <w:sz w:val="22"/>
+          <w:rFonts w:ascii="Consolas" w:hAnsi="Consolas"/>
+          <w:b w:val="0"/>
+          <w:sz w:val="19"/>
         </w:rPr>
-        <w:t xml:space="preserve">instalar-silencioso.ps1: </w:t>
+        <w:t>instalar-silencioso.ps1</w:t>
       </w:r>
       <w:r>
         <w:rPr>
-          <w:sz w:val="22"/>
+          <w:b w:val="0"/>
         </w:rPr>
-        <w:t>instala sem prompts, com código de saída; copia para C:\Program Files\GerencIA.</w:t>
+        <w:t xml:space="preserve"> — instala sem prompts, com código de saída; copia para </w:t>
+      </w:r>
+      <w:r>
+        <w:rPr>
+          <w:rFonts w:ascii="Consolas" w:hAnsi="Consolas"/>
+          <w:b w:val="0"/>
+          <w:sz w:val="19"/>
+        </w:rPr>
+        <w:t>C:\Program Files\GerencIA</w:t>
+      </w:r>
+      <w:r>
+        <w:rPr>
+          <w:b w:val="0"/>
+        </w:rPr>
+        <w:t>.</w:t>
       </w:r>
     </w:p>
     <w:p>
@@ -1155,33 +2109,127 @@
       </w:pPr>
       <w:r>
         <w:rPr>
-          <w:b/>
-          <w:sz w:val="22"/>
+          <w:rFonts w:ascii="Consolas" w:hAnsi="Consolas"/>
+          <w:b w:val="0"/>
+          <w:sz w:val="19"/>
         </w:rPr>
-        <w:t xml:space="preserve">detectar.ps1 / desinstalar-silencioso.ps1: </w:t>
+        <w:t>detectar.ps1</w:t>
       </w:r>
       <w:r>
         <w:rPr>
-          <w:sz w:val="22"/>
+          <w:b w:val="0"/>
         </w:rPr>
-        <w:t>detecção do Win32 app no Intune / remoção central.</w:t>
+        <w:t xml:space="preserve"> — regra de detecção do Win32 app no Intune. </w:t>
+      </w:r>
+      <w:r>
+        <w:rPr>
+          <w:rFonts w:ascii="Consolas" w:hAnsi="Consolas"/>
+          <w:b w:val="0"/>
+          <w:sz w:val="19"/>
+        </w:rPr>
+        <w:t>desinstalar-silencioso.ps1</w:t>
+      </w:r>
+      <w:r>
+        <w:rPr>
+          <w:b w:val="0"/>
+        </w:rPr>
+        <w:t xml:space="preserve"> — remoção central.</w:t>
+      </w:r>
+    </w:p>
+    <w:p>
+      <w:r>
+        <w:rPr>
+          <w:b w:val="0"/>
+        </w:rPr>
+        <w:t xml:space="preserve">Passo a passo completo em </w:t>
+      </w:r>
+      <w:r>
+        <w:rPr>
+          <w:rFonts w:ascii="Consolas" w:hAnsi="Consolas"/>
+          <w:b w:val="0"/>
+          <w:sz w:val="19"/>
+        </w:rPr>
+        <w:t>deploy/LEIA-DEPLOY.md</w:t>
+      </w:r>
+      <w:r>
+        <w:rPr>
+          <w:b w:val="0"/>
+        </w:rPr>
+        <w:t xml:space="preserve"> (dentro do pacote).</w:t>
       </w:r>
     </w:p>
     <w:p>
       <w:pPr>
-        <w:spacing w:line="300" w:lineRule="auto"/>
+        <w:ind w:left="200"/>
       </w:pPr>
       <w:r>
         <w:rPr>
-          <w:color w:val="2C2C2A"/>
-          <w:sz w:val="22"/>
+          <w:b/>
+          <w:i/>
+          <w:color w:val="55605A"/>
         </w:rPr>
-        <w:t>Passo a passo completo em deploy/LEIA-DEPLOY.md (dentro do pacote).</w:t>
+        <w:t>Camadas, em resumo:</w:t>
+      </w:r>
+      <w:r>
+        <w:rPr>
+          <w:b w:val="0"/>
+          <w:i/>
+          <w:color w:val="55605A"/>
+        </w:rPr>
+        <w:t xml:space="preserve"> </w:t>
+      </w:r>
+      <w:r>
+        <w:rPr>
+          <w:b/>
+          <w:i/>
+          <w:color w:val="55605A"/>
+        </w:rPr>
+        <w:t>Agente</w:t>
+      </w:r>
+      <w:r>
+        <w:rPr>
+          <w:b w:val="0"/>
+          <w:i/>
+          <w:color w:val="55605A"/>
+        </w:rPr>
+        <w:t xml:space="preserve"> = presença (metadado, qualquer app). </w:t>
+      </w:r>
+      <w:r>
+        <w:rPr>
+          <w:b/>
+          <w:i/>
+          <w:color w:val="55605A"/>
+        </w:rPr>
+        <w:t>Extensão</w:t>
+      </w:r>
+      <w:r>
+        <w:rPr>
+          <w:b w:val="0"/>
+          <w:i/>
+          <w:color w:val="55605A"/>
+        </w:rPr>
+        <w:t xml:space="preserve"> = conteúdo (navegador). </w:t>
+      </w:r>
+      <w:r>
+        <w:rPr>
+          <w:b/>
+          <w:i/>
+          <w:color w:val="55605A"/>
+        </w:rPr>
+        <w:t>Proxy MITM</w:t>
+      </w:r>
+      <w:r>
+        <w:rPr>
+          <w:b w:val="0"/>
+          <w:i/>
+          <w:color w:val="55605A"/>
+        </w:rPr>
+        <w:t xml:space="preserve"> (opcional) = conteúdo de qualquer app, só com aval de Segurança. O conteúdo é classificado on-premise pelo Qwen3; a nuvem é exceção.</w:t>
       </w:r>
     </w:p>
     <w:sectPr>
       <w:pgSz w:w="12240" w:h="15840"/>
-      <w:pgMar w:top="1296" w:right="1440" w:bottom="1296" w:left="1440" w:header="720" w:footer="720" w:gutter="0"/>
+      <w:pgMar w:top="1440" w:right="1800" w:bottom="1440" w:left="1800" w:header="720" w:footer="720" w:gutter="0"/>
       <w:cols w:space="720"/>
       <w:docGrid w:linePitch="360"/>
     </w:sectPr>
@@ -1554,8 +2602,7 @@
     <w:rsid w:val="00FC693F"/>
     <w:rPr>
       <w:rFonts w:ascii="Calibri" w:hAnsi="Calibri"/>
-      <w:color w:val="16211C"/>
-      <w:sz w:val="22"/>
+      <w:sz w:val="21"/>
     </w:rPr>
   </w:style>
   <w:style w:type="paragraph" w:styleId="Header">

</xml_diff>

<commit_message>
Extensão: exclusão do Defender no atualizador (falso-positivo apaga a extensão)
O host nativo (.py/.bat/.ps1) + o registro por script disparam o heurístico do
Defender, que apaga a extensão extraída. O ATUALIZAR-EXTENSAO.ps1 agora adiciona
Add-MpPreference -ExclusionPath na pasta base (C:\GerencIA) antes de extrair e
baixa o zip para dentro dela; sem admin, mostra o comando manual. Manual com
linha de troubleshooting. Pacotes regerados.

Co-Authored-By: Claude Opus 4.8 <noreply@anthropic.com>
</commit_message>
<xml_diff>
--- a/apresentacao/GerencIA-Manual-Instalacao.docx
+++ b/apresentacao/GerencIA-Manual-Instalacao.docx
@@ -2015,6 +2015,74 @@
           </w:p>
         </w:tc>
       </w:tr>
+      <w:tr>
+        <w:tc>
+          <w:tcPr>
+            <w:tcW w:type="dxa" w:w="4320"/>
+          </w:tcPr>
+          <w:p>
+            <w:r/>
+            <w:r>
+              <w:rPr>
+                <w:b w:val="0"/>
+              </w:rPr>
+              <w:t>Defender apaga a extensão (“vírus detectado”)</w:t>
+            </w:r>
+          </w:p>
+        </w:tc>
+        <w:tc>
+          <w:tcPr>
+            <w:tcW w:type="dxa" w:w="4320"/>
+          </w:tcPr>
+          <w:p>
+            <w:r/>
+            <w:r>
+              <w:rPr>
+                <w:b w:val="0"/>
+              </w:rPr>
+              <w:t xml:space="preserve">Falso-positivo (host nativo + script). Como </w:t>
+            </w:r>
+            <w:r>
+              <w:rPr>
+                <w:b/>
+              </w:rPr>
+              <w:t>admin</w:t>
+            </w:r>
+            <w:r>
+              <w:rPr>
+                <w:b w:val="0"/>
+              </w:rPr>
+              <w:t xml:space="preserve">, uma vez: </w:t>
+            </w:r>
+            <w:r>
+              <w:rPr>
+                <w:rFonts w:ascii="Consolas" w:hAnsi="Consolas"/>
+                <w:b w:val="0"/>
+                <w:sz w:val="19"/>
+              </w:rPr>
+              <w:t>Add-MpPreference -ExclusionPath 'C:\GerencIA'</w:t>
+            </w:r>
+            <w:r>
+              <w:rPr>
+                <w:b w:val="0"/>
+              </w:rPr>
+              <w:t xml:space="preserve">; restaure em </w:t>
+            </w:r>
+            <w:r>
+              <w:rPr>
+                <w:b w:val="0"/>
+              </w:rPr>
+              <w:t>Segurança do Windows → Histórico de proteção</w:t>
+            </w:r>
+            <w:r>
+              <w:rPr>
+                <w:b w:val="0"/>
+              </w:rPr>
+              <w:t xml:space="preserve"> e rode o atualizador de novo (ele já tenta a exclusão).</w:t>
+            </w:r>
+          </w:p>
+        </w:tc>
+      </w:tr>
     </w:tbl>
     <w:p/>
     <w:p>

</xml_diff>

<commit_message>
Manual: alternativa de instalação da extensão via PowerShell direto (com exclusão do Defender)
Co-Authored-By: Claude Opus 4.8 <noreply@anthropic.com>
</commit_message>
<xml_diff>
--- a/apresentacao/GerencIA-Manual-Instalacao.docx
+++ b/apresentacao/GerencIA-Manual-Instalacao.docx
@@ -1143,6 +1143,88 @@
       </w:r>
     </w:p>
     <w:p>
+      <w:r>
+        <w:rPr>
+          <w:b/>
+        </w:rPr>
+        <w:t>Alternativa (PowerShell direto, como administrador)</w:t>
+      </w:r>
+      <w:r>
+        <w:rPr>
+          <w:b w:val="0"/>
+        </w:rPr>
+        <w:t xml:space="preserve"> — a 1ª linha evita o falso-positivo do Defender:</w:t>
+      </w:r>
+    </w:p>
+    <w:p>
+      <w:pPr>
+        <w:ind w:left="160"/>
+      </w:pPr>
+      <w:r>
+        <w:rPr>
+          <w:rFonts w:ascii="Consolas" w:hAnsi="Consolas"/>
+          <w:b w:val="0"/>
+          <w:color w:val="143A2C"/>
+          <w:sz w:val="19"/>
+        </w:rPr>
+        <w:t>New-Item -ItemType Directory -Force -Path C:\GerencIA | Out-Null</w:t>
+      </w:r>
+      <w:r>
+        <w:rPr>
+          <w:color w:val="143A2C"/>
+        </w:rPr>
+        <w:br/>
+      </w:r>
+      <w:r>
+        <w:rPr>
+          <w:rFonts w:ascii="Consolas" w:hAnsi="Consolas"/>
+          <w:b w:val="0"/>
+          <w:color w:val="143A2C"/>
+          <w:sz w:val="19"/>
+        </w:rPr>
+        <w:t xml:space="preserve">Add-MpPreference -ExclusionPath "C:\GerencIA"   </w:t>
+      </w:r>
+      <w:r>
+        <w:rPr>
+          <w:rFonts w:ascii="Consolas" w:hAnsi="Consolas"/>
+          <w:b w:val="0"/>
+          <w:color w:val="143A2C"/>
+          <w:sz w:val="19"/>
+        </w:rPr>
+        <w:t># 1x, mantém o antivírus ligado</w:t>
+      </w:r>
+      <w:r>
+        <w:rPr>
+          <w:color w:val="143A2C"/>
+        </w:rPr>
+        <w:br/>
+      </w:r>
+      <w:r>
+        <w:rPr>
+          <w:rFonts w:ascii="Consolas" w:hAnsi="Consolas"/>
+          <w:b w:val="0"/>
+          <w:color w:val="143A2C"/>
+          <w:sz w:val="19"/>
+        </w:rPr>
+        <w:t>Invoke-WebRequest "https://raw.githubusercontent.com/lucibad/espia-starkbank/main/borda/pacotes/gerencia-extensao-chrome-edge-0.3.0.zip" -OutFile C:\GerencIA\ext.zip</w:t>
+      </w:r>
+      <w:r>
+        <w:rPr>
+          <w:color w:val="143A2C"/>
+        </w:rPr>
+        <w:br/>
+      </w:r>
+      <w:r>
+        <w:rPr>
+          <w:rFonts w:ascii="Consolas" w:hAnsi="Consolas"/>
+          <w:b w:val="0"/>
+          <w:color w:val="143A2C"/>
+          <w:sz w:val="19"/>
+        </w:rPr>
+        <w:t>Expand-Archive C:\GerencIA\ext.zip -DestinationPath C:\GerencIA\extensao -Force</w:t>
+      </w:r>
+    </w:p>
+    <w:p>
       <w:pPr>
         <w:pStyle w:val="Heading2"/>
       </w:pPr>
@@ -1323,7 +1405,7 @@
         <w:rPr>
           <w:b w:val="0"/>
         </w:rPr>
-        <w:t xml:space="preserve"> (para reler o host nativo) e dê </w:t>
+        <w:t xml:space="preserve"> e dê </w:t>
       </w:r>
       <w:r>
         <w:rPr>
@@ -1335,7 +1417,7 @@
         <w:rPr>
           <w:b w:val="0"/>
         </w:rPr>
-        <w:t xml:space="preserve"> na aba da IA. No popup da extensão: </w:t>
+        <w:t xml:space="preserve"> na aba da IA. No popup: </w:t>
       </w:r>
       <w:r>
         <w:rPr>
@@ -1347,7 +1429,7 @@
         <w:rPr>
           <w:b w:val="0"/>
         </w:rPr>
-        <w:t xml:space="preserve"> e </w:t>
+        <w:t xml:space="preserve"> e o </w:t>
       </w:r>
       <w:r>
         <w:rPr>
@@ -1359,7 +1441,7 @@
         <w:rPr>
           <w:b w:val="0"/>
         </w:rPr>
-        <w:t xml:space="preserve"> com o nome real. Faça uma busca no ChatGPT e veja o conteúdo no painel → </w:t>
+        <w:t xml:space="preserve"> real. Faça uma busca e veja no painel → </w:t>
       </w:r>
       <w:r>
         <w:rPr>
@@ -1384,7 +1466,7 @@
           <w:i/>
           <w:color w:val="55605A"/>
         </w:rPr>
-        <w:t>Identidade multiusuário:</w:t>
+        <w:t>Multiusuário:</w:t>
       </w:r>
       <w:r>
         <w:rPr>
@@ -1392,7 +1474,7 @@
           <w:i/>
           <w:color w:val="55605A"/>
         </w:rPr>
-        <w:t xml:space="preserve"> o ID da extensão é fixo (chave no manifesto). Cada usuário do Windows roda o </w:t>
+        <w:t xml:space="preserve"> o ID da extensão é fixo; cada usuário roda o </w:t>
       </w:r>
       <w:r>
         <w:rPr>
@@ -1410,7 +1492,7 @@
           <w:i/>
           <w:color w:val="55605A"/>
         </w:rPr>
-        <w:t xml:space="preserve"> uma vez (registra o host nativo no perfil dele) — e aparece com o próprio nome.</w:t>
+        <w:t xml:space="preserve"> uma vez e passa a aparecer com o próprio nome.</w:t>
       </w:r>
     </w:p>
     <w:p>

</xml_diff>

<commit_message>
Gamma: adiciona à detecção (extensão + agente) e à classificação; pacotes 0.3.1
- Extensão 0.3.1: content_scripts + FERRAMENTAS + seletor de resposta para
  gamma.app e gamma.design (captura prompt/resposta no site).
- Agente (sensor): DOMINIOS_IA inclui gamma.app/gamma.design.
- captura.py: canônico + semente de inventário para Gamma (status 'Não aprovada').
- Pacotes regenerados 0.3.1; manual/atualizador/popup atualizados.

Co-Authored-By: Claude Opus 4.8 <noreply@anthropic.com>
</commit_message>
<xml_diff>
--- a/apresentacao/GerencIA-Manual-Instalacao.docx
+++ b/apresentacao/GerencIA-Manual-Instalacao.docx
@@ -522,7 +522,7 @@
                 <w:b w:val="0"/>
                 <w:sz w:val="19"/>
               </w:rPr>
-              <w:t>borda/pacotes/gerencia-extensao-chrome-edge-0.3.0.zip</w:t>
+              <w:t>borda/pacotes/gerencia-extensao-chrome-edge-0.3.1.zip</w:t>
             </w:r>
           </w:p>
         </w:tc>
@@ -554,7 +554,7 @@
                 <w:b w:val="0"/>
                 <w:sz w:val="19"/>
               </w:rPr>
-              <w:t>borda/pacotes/gerencia-extensao-firefox-0.3.0.xpi</w:t>
+              <w:t>borda/pacotes/gerencia-extensao-firefox-0.3.1.xpi</w:t>
             </w:r>
           </w:p>
         </w:tc>
@@ -1119,7 +1119,7 @@
           <w:b w:val="0"/>
           <w:sz w:val="19"/>
         </w:rPr>
-        <w:t>versao: 0.3.0</w:t>
+        <w:t>versao: 0.3.1</w:t>
       </w:r>
       <w:r>
         <w:rPr>
@@ -1206,7 +1206,7 @@
           <w:color w:val="143A2C"/>
           <w:sz w:val="19"/>
         </w:rPr>
-        <w:t>Invoke-WebRequest "https://raw.githubusercontent.com/lucibad/espia-starkbank/main/borda/pacotes/gerencia-extensao-chrome-edge-0.3.0.zip" -OutFile C:\GerencIA\ext.zip</w:t>
+        <w:t>Invoke-WebRequest "https://raw.githubusercontent.com/lucibad/espia-starkbank/main/borda/pacotes/gerencia-extensao-chrome-edge-0.3.1.zip" -OutFile C:\GerencIA\ext.zip</w:t>
       </w:r>
       <w:r>
         <w:rPr>
@@ -1293,7 +1293,7 @@
         <w:rPr>
           <w:b/>
         </w:rPr>
-        <w:t>0.3.0</w:t>
+        <w:t>0.3.1</w:t>
       </w:r>
       <w:r>
         <w:rPr>
@@ -2086,7 +2086,7 @@
               <w:rPr>
                 <w:b/>
               </w:rPr>
-              <w:t>0.3.0</w:t>
+              <w:t>0.3.1</w:t>
             </w:r>
             <w:r>
               <w:rPr>

</xml_diff>

<commit_message>
Anexos: resumo (Qwen3) + classificação do conteúdo do anexo, exibido na Ficha do evento
- Extensão 0.3.2: captura anexos (texto lido direto; PDF em base64; outros só
  nome/tipo) e envia junto com o prompt.
- Coletor/captura: classificador_local.resumir() (Qwen3); PDF extraído com pypdf;
  o anexo é resumido e o resumo é submetido à classificação (detectores->Qwen3).
  Colunas anexo_* em capturas; /api/conteudo e conteudos_map (mascarado p/ Pages).
- Painel: Ficha do evento mostra 'Conteúdo do anexo (resumo)' com nome, classe e
  resumo. Pacotes 0.3.2; manual atualizado.

Co-Authored-By: Claude Opus 4.8 <noreply@anthropic.com>
</commit_message>
<xml_diff>
--- a/apresentacao/GerencIA-Manual-Instalacao.docx
+++ b/apresentacao/GerencIA-Manual-Instalacao.docx
@@ -522,7 +522,7 @@
                 <w:b w:val="0"/>
                 <w:sz w:val="19"/>
               </w:rPr>
-              <w:t>borda/pacotes/gerencia-extensao-chrome-edge-0.3.1.zip</w:t>
+              <w:t>borda/pacotes/gerencia-extensao-chrome-edge-0.3.2.zip</w:t>
             </w:r>
           </w:p>
         </w:tc>
@@ -554,7 +554,7 @@
                 <w:b w:val="0"/>
                 <w:sz w:val="19"/>
               </w:rPr>
-              <w:t>borda/pacotes/gerencia-extensao-firefox-0.3.1.xpi</w:t>
+              <w:t>borda/pacotes/gerencia-extensao-firefox-0.3.2.xpi</w:t>
             </w:r>
           </w:p>
         </w:tc>
@@ -1119,7 +1119,7 @@
           <w:b w:val="0"/>
           <w:sz w:val="19"/>
         </w:rPr>
-        <w:t>versao: 0.3.1</w:t>
+        <w:t>versao: 0.3.2</w:t>
       </w:r>
       <w:r>
         <w:rPr>
@@ -1206,7 +1206,7 @@
           <w:color w:val="143A2C"/>
           <w:sz w:val="19"/>
         </w:rPr>
-        <w:t>Invoke-WebRequest "https://raw.githubusercontent.com/lucibad/espia-starkbank/main/borda/pacotes/gerencia-extensao-chrome-edge-0.3.1.zip" -OutFile C:\GerencIA\ext.zip</w:t>
+        <w:t>Invoke-WebRequest "https://raw.githubusercontent.com/lucibad/espia-starkbank/main/borda/pacotes/gerencia-extensao-chrome-edge-0.3.2.zip" -OutFile C:\GerencIA\ext.zip</w:t>
       </w:r>
       <w:r>
         <w:rPr>
@@ -1293,7 +1293,7 @@
         <w:rPr>
           <w:b/>
         </w:rPr>
-        <w:t>0.3.1</w:t>
+        <w:t>0.3.2</w:t>
       </w:r>
       <w:r>
         <w:rPr>
@@ -2086,7 +2086,7 @@
               <w:rPr>
                 <w:b/>
               </w:rPr>
-              <w:t>0.3.1</w:t>
+              <w:t>0.3.2</w:t>
             </w:r>
             <w:r>
               <w:rPr>

</xml_diff>